<commit_message>
local update 09 MAY 26
</commit_message>
<xml_diff>
--- a/WeeklyReports/25-06-MAY-26.docx
+++ b/WeeklyReports/25-06-MAY-26.docx
@@ -1,27 +1,35 @@
 
 <file path=word/document.xml><?xml version="1.0" encoding="utf-8"?>
-<w:document xmlns:wpc="http://schemas.microsoft.com/office/word/2010/wordprocessingCanvas" xmlns:cx="http://schemas.microsoft.com/office/drawing/2014/chartex" xmlns:cx1="http://schemas.microsoft.com/office/drawing/2015/9/8/chartex" xmlns:cx2="http://schemas.microsoft.com/office/drawing/2015/10/21/chartex" xmlns:cx3="http://schemas.microsoft.com/office/drawing/2016/5/9/chartex" xmlns:cx4="http://schemas.microsoft.com/office/drawing/2016/5/10/chartex" xmlns:cx5="http://schemas.microsoft.com/office/drawing/2016/5/11/chartex" xmlns:cx6="http://schemas.microsoft.com/office/drawing/2016/5/12/chartex" xmlns:cx7="http://schemas.microsoft.com/office/drawing/2016/5/13/chartex" xmlns:cx8="http://schemas.microsoft.com/office/drawing/2016/5/14/chartex" xmlns:mc="http://schemas.openxmlformats.org/markup-compatibility/2006" xmlns:aink="http://schemas.microsoft.com/office/drawing/2016/ink" xmlns:am3d="http://schemas.microsoft.com/office/drawing/2017/model3d" xmlns:o="urn:schemas-microsoft-com:office:office" xmlns:oel="http://schemas.microsoft.com/office/2019/extlst" xmlns:r="http://schemas.openxmlformats.org/officeDocument/2006/relationships" xmlns:m="http://schemas.openxmlformats.org/officeDocument/2006/math" xmlns:v="urn:schemas-microsoft-com:vml" xmlns:wp14="http://schemas.microsoft.com/office/word/2010/wordprocessingDrawing" xmlns:wp="http://schemas.openxmlformats.org/drawingml/2006/wordprocessingDrawing" xmlns:w10="urn:schemas-microsoft-com:office:word" xmlns:w="http://schemas.openxmlformats.org/wordprocessingml/2006/main" xmlns:w14="http://schemas.microsoft.com/office/word/2010/wordml" xmlns:w15="http://schemas.microsoft.com/office/word/2012/wordml" xmlns:w16cex="http://schemas.microsoft.com/office/word/2018/wordml/cex" xmlns:w16cid="http://schemas.microsoft.com/office/word/2016/wordml/cid" xmlns:w16="http://schemas.microsoft.com/office/word/2018/wordml" xmlns:w16du="http://schemas.microsoft.com/office/word/2023/wordml/word16du" xmlns:w16sdtdh="http://schemas.microsoft.com/office/word/2020/wordml/sdtdatahash" xmlns:w16sdtfl="http://schemas.microsoft.com/office/word/2024/wordml/sdtformatlock" xmlns:w16se="http://schemas.microsoft.com/office/word/2015/wordml/symex" xmlns:wpg="http://schemas.microsoft.com/office/word/2010/wordprocessingGroup" xmlns:wpi="http://schemas.microsoft.com/office/word/2010/wordprocessingInk" xmlns:wne="http://schemas.microsoft.com/office/word/2006/wordml" xmlns:wps="http://schemas.microsoft.com/office/word/2010/wordprocessingShape" mc:Ignorable="w14 w15 w16se w16cid w16 w16cex w16sdtdh w16sdtfl w16du wp14">
+<w:document xmlns:o="urn:schemas-microsoft-com:office:office" xmlns:r="http://schemas.openxmlformats.org/officeDocument/2006/relationships" xmlns:v="urn:schemas-microsoft-com:vml" xmlns:w="http://schemas.openxmlformats.org/wordprocessingml/2006/main" xmlns:w10="urn:schemas-microsoft-com:office:word" xmlns:wp="http://schemas.openxmlformats.org/drawingml/2006/wordprocessingDrawing" xmlns:pic="http://schemas.openxmlformats.org/drawingml/2006/picture" xmlns:wps="http://schemas.microsoft.com/office/word/2010/wordprocessingShape" xmlns:wpg="http://schemas.microsoft.com/office/word/2010/wordprocessingGroup" xmlns:mc="http://schemas.openxmlformats.org/markup-compatibility/2006" xmlns:wp14="http://schemas.microsoft.com/office/word/2010/wordprocessingDrawing" xmlns:w14="http://schemas.microsoft.com/office/word/2010/wordml" xmlns:w15="http://schemas.microsoft.com/office/word/2012/wordml" mc:Ignorable="w14 wp14 w15">
   <w:body>
     <w:p>
       <w:pPr>
+        <w:pStyle w:val="Normal"/>
         <w:widowControl/>
-        <w:jc w:val="left"/>
+        <w:jc w:val="start"/>
         <w:rPr>
           <w:rFonts w:ascii="Arial" w:hAnsi="Arial" w:cs="Arial"/>
         </w:rPr>
       </w:pPr>
+      <w:r>
+        <w:rPr>
+          <w:rFonts w:cs="Arial" w:ascii="Arial" w:hAnsi="Arial"/>
+        </w:rPr>
+      </w:r>
     </w:p>
     <w:tbl>
       <w:tblPr>
         <w:tblW w:w="9023" w:type="dxa"/>
+        <w:jc w:val="start"/>
+        <w:tblInd w:w="0" w:type="dxa"/>
         <w:tblLayout w:type="fixed"/>
         <w:tblCellMar>
           <w:top w:w="28" w:type="dxa"/>
-          <w:left w:w="102" w:type="dxa"/>
+          <w:start w:w="102" w:type="dxa"/>
           <w:bottom w:w="28" w:type="dxa"/>
-          <w:right w:w="102" w:type="dxa"/>
+          <w:end w:w="102" w:type="dxa"/>
         </w:tblCellMar>
-        <w:tblLook w:val="04A0" w:firstRow="1" w:lastRow="0" w:firstColumn="1" w:lastColumn="0" w:noHBand="0" w:noVBand="1"/>
+        <w:tblLook w:val="04a0" w:noVBand="1" w:noHBand="0" w:lastColumn="0" w:firstColumn="1" w:lastRow="0" w:firstRow="1"/>
       </w:tblPr>
       <w:tblGrid>
         <w:gridCol w:w="1182"/>
@@ -40,7 +48,7 @@
       </w:tblGrid>
       <w:tr>
         <w:trPr>
-          <w:trHeight w:val="370"/>
+          <w:trHeight w:val="370" w:hRule="atLeast"/>
         </w:trPr>
         <w:tc>
           <w:tcPr>
@@ -49,12 +57,13 @@
             <w:vMerge w:val="restart"/>
             <w:tcBorders>
               <w:bottom w:val="single" w:sz="2" w:space="0" w:color="000000"/>
-              <w:right w:val="single" w:sz="2" w:space="0" w:color="000000"/>
-            </w:tcBorders>
-            <w:vAlign w:val="center"/>
-          </w:tcPr>
-          <w:p>
-            <w:pPr>
+              <w:end w:val="single" w:sz="2" w:space="0" w:color="000000"/>
+            </w:tcBorders>
+            <w:vAlign w:val="center"/>
+          </w:tcPr>
+          <w:p>
+            <w:pPr>
+              <w:pStyle w:val="Normal"/>
               <w:jc w:val="center"/>
               <w:rPr>
                 <w:rFonts w:ascii="Arial" w:hAnsi="Arial" w:cs="Arial"/>
@@ -68,38 +77,23 @@
                 <w:sz w:val="32"/>
                 <w:szCs w:val="32"/>
               </w:rPr>
-              <w:t>주간업무</w:t>
-            </w:r>
-            <w:r>
-              <w:rPr>
-                <w:rFonts w:ascii="Arial" w:hAnsi="Arial" w:cs="Arial" w:hint="eastAsia"/>
+              <w:t>주간업무 회의</w:t>
+            </w:r>
+          </w:p>
+          <w:p>
+            <w:pPr>
+              <w:pStyle w:val="Normal"/>
+              <w:jc w:val="center"/>
+              <w:rPr>
+                <w:rFonts w:ascii="Arial" w:hAnsi="Arial" w:cs="Arial"/>
+              </w:rPr>
+            </w:pPr>
+            <w:r>
+              <w:rPr>
+                <w:rFonts w:cs="Arial" w:hint="eastAsia" w:ascii="Arial" w:hAnsi="Arial"/>
                 <w:sz w:val="32"/>
                 <w:szCs w:val="32"/>
               </w:rPr>
-              <w:t xml:space="preserve"> </w:t>
-            </w:r>
-            <w:r>
-              <w:rPr>
-                <w:rFonts w:ascii="Arial" w:hAnsi="Arial" w:cs="Arial" w:hint="eastAsia"/>
-                <w:sz w:val="32"/>
-                <w:szCs w:val="32"/>
-              </w:rPr>
-              <w:t>회의</w:t>
-            </w:r>
-          </w:p>
-          <w:p>
-            <w:pPr>
-              <w:jc w:val="center"/>
-              <w:rPr>
-                <w:rFonts w:ascii="Arial" w:hAnsi="Arial" w:cs="Arial"/>
-              </w:rPr>
-            </w:pPr>
-            <w:r>
-              <w:rPr>
-                <w:rFonts w:ascii="Arial" w:hAnsi="Arial" w:cs="Arial" w:hint="eastAsia"/>
-                <w:sz w:val="32"/>
-                <w:szCs w:val="32"/>
-              </w:rPr>
               <w:t>(Design Review)</w:t>
             </w:r>
           </w:p>
@@ -110,21 +104,22 @@
             <w:gridSpan w:val="2"/>
             <w:tcBorders>
               <w:top w:val="single" w:sz="2" w:space="0" w:color="000000"/>
-              <w:left w:val="single" w:sz="2" w:space="0" w:color="000000"/>
+              <w:start w:val="single" w:sz="2" w:space="0" w:color="000000"/>
               <w:bottom w:val="single" w:sz="2" w:space="0" w:color="000000"/>
-              <w:right w:val="single" w:sz="2" w:space="0" w:color="000000"/>
-            </w:tcBorders>
-            <w:vAlign w:val="center"/>
-          </w:tcPr>
-          <w:p>
-            <w:pPr>
-              <w:rPr>
-                <w:rFonts w:ascii="Arial" w:hAnsi="Arial" w:cs="Arial"/>
-              </w:rPr>
-            </w:pPr>
-            <w:r>
-              <w:rPr>
-                <w:rFonts w:ascii="Arial" w:hAnsi="Arial" w:cs="Arial" w:hint="eastAsia"/>
+              <w:end w:val="single" w:sz="2" w:space="0" w:color="000000"/>
+            </w:tcBorders>
+            <w:vAlign w:val="center"/>
+          </w:tcPr>
+          <w:p>
+            <w:pPr>
+              <w:pStyle w:val="Normal"/>
+              <w:rPr>
+                <w:rFonts w:ascii="Arial" w:hAnsi="Arial" w:cs="Arial"/>
+              </w:rPr>
+            </w:pPr>
+            <w:r>
+              <w:rPr>
+                <w:rFonts w:cs="Arial" w:hint="eastAsia" w:ascii="Arial" w:hAnsi="Arial"/>
               </w:rPr>
               <w:t xml:space="preserve">Prepared by </w:t>
             </w:r>
@@ -136,21 +131,22 @@
             <w:gridSpan w:val="3"/>
             <w:tcBorders>
               <w:top w:val="single" w:sz="2" w:space="0" w:color="000000"/>
-              <w:left w:val="single" w:sz="2" w:space="0" w:color="000000"/>
+              <w:start w:val="single" w:sz="2" w:space="0" w:color="000000"/>
               <w:bottom w:val="single" w:sz="2" w:space="0" w:color="000000"/>
-              <w:right w:val="single" w:sz="2" w:space="0" w:color="000000"/>
-            </w:tcBorders>
-            <w:vAlign w:val="center"/>
-          </w:tcPr>
-          <w:p>
-            <w:pPr>
-              <w:rPr>
-                <w:rFonts w:ascii="Arial" w:hAnsi="Arial" w:cs="Arial"/>
-              </w:rPr>
-            </w:pPr>
-            <w:r>
-              <w:rPr>
-                <w:rFonts w:ascii="Arial" w:hAnsi="Arial" w:cs="Arial"/>
+              <w:end w:val="single" w:sz="2" w:space="0" w:color="000000"/>
+            </w:tcBorders>
+            <w:vAlign w:val="center"/>
+          </w:tcPr>
+          <w:p>
+            <w:pPr>
+              <w:pStyle w:val="Normal"/>
+              <w:rPr>
+                <w:rFonts w:ascii="Arial" w:hAnsi="Arial" w:cs="Arial"/>
+              </w:rPr>
+            </w:pPr>
+            <w:r>
+              <w:rPr>
+                <w:rFonts w:cs="Arial" w:ascii="Arial" w:hAnsi="Arial"/>
               </w:rPr>
               <w:t>Jibon</w:t>
             </w:r>
@@ -161,48 +157,60 @@
             <w:tcW w:w="713" w:type="dxa"/>
             <w:tcBorders>
               <w:top w:val="single" w:sz="2" w:space="0" w:color="000000"/>
-              <w:left w:val="single" w:sz="2" w:space="0" w:color="000000"/>
+              <w:start w:val="single" w:sz="2" w:space="0" w:color="000000"/>
               <w:bottom w:val="single" w:sz="2" w:space="0" w:color="000000"/>
-              <w:right w:val="single" w:sz="2" w:space="0" w:color="000000"/>
-            </w:tcBorders>
-            <w:vAlign w:val="center"/>
-          </w:tcPr>
-          <w:p>
-            <w:pPr>
-              <w:rPr>
-                <w:rFonts w:ascii="Arial" w:hAnsi="Arial" w:cs="Arial"/>
-              </w:rPr>
-            </w:pPr>
+              <w:end w:val="single" w:sz="2" w:space="0" w:color="000000"/>
+            </w:tcBorders>
+            <w:vAlign w:val="center"/>
+          </w:tcPr>
+          <w:p>
+            <w:pPr>
+              <w:pStyle w:val="Normal"/>
+              <w:rPr>
+                <w:rFonts w:ascii="Arial" w:hAnsi="Arial" w:cs="Arial"/>
+              </w:rPr>
+            </w:pPr>
+            <w:r>
+              <w:rPr>
+                <w:rFonts w:cs="Arial" w:ascii="Arial" w:hAnsi="Arial"/>
+              </w:rPr>
+            </w:r>
           </w:p>
         </w:tc>
       </w:tr>
       <w:tr>
         <w:trPr>
-          <w:trHeight w:val="370"/>
+          <w:trHeight w:val="370" w:hRule="atLeast"/>
         </w:trPr>
         <w:tc>
           <w:tcPr>
             <w:tcW w:w="5540" w:type="dxa"/>
             <w:gridSpan w:val="7"/>
-            <w:vMerge/>
+            <w:vMerge w:val="continue"/>
             <w:tcBorders>
               <w:bottom w:val="single" w:sz="2" w:space="0" w:color="000000"/>
-              <w:right w:val="single" w:sz="2" w:space="0" w:color="000000"/>
+              <w:end w:val="single" w:sz="2" w:space="0" w:color="000000"/>
             </w:tcBorders>
             <w:tcMar>
               <w:top w:w="0" w:type="dxa"/>
-              <w:left w:w="108" w:type="dxa"/>
+              <w:start w:w="108" w:type="dxa"/>
               <w:bottom w:w="0" w:type="dxa"/>
-              <w:right w:w="108" w:type="dxa"/>
+              <w:end w:w="108" w:type="dxa"/>
             </w:tcMar>
             <w:vAlign w:val="center"/>
           </w:tcPr>
           <w:p>
             <w:pPr>
-              <w:rPr>
-                <w:rFonts w:ascii="Arial" w:hAnsi="Arial" w:cs="Arial"/>
-              </w:rPr>
-            </w:pPr>
+              <w:pStyle w:val="Normal"/>
+              <w:rPr>
+                <w:rFonts w:ascii="Arial" w:hAnsi="Arial" w:cs="Arial"/>
+              </w:rPr>
+            </w:pPr>
+            <w:r>
+              <w:rPr>
+                <w:rFonts w:cs="Arial" w:ascii="Arial" w:hAnsi="Arial"/>
+              </w:rPr>
+            </w:r>
           </w:p>
         </w:tc>
         <w:tc>
@@ -211,21 +219,22 @@
             <w:gridSpan w:val="2"/>
             <w:tcBorders>
               <w:top w:val="single" w:sz="2" w:space="0" w:color="000000"/>
-              <w:left w:val="single" w:sz="2" w:space="0" w:color="000000"/>
+              <w:start w:val="single" w:sz="2" w:space="0" w:color="000000"/>
               <w:bottom w:val="single" w:sz="2" w:space="0" w:color="000000"/>
-              <w:right w:val="single" w:sz="2" w:space="0" w:color="000000"/>
-            </w:tcBorders>
-            <w:vAlign w:val="center"/>
-          </w:tcPr>
-          <w:p>
-            <w:pPr>
-              <w:rPr>
-                <w:rFonts w:ascii="Arial" w:hAnsi="Arial" w:cs="Arial"/>
-              </w:rPr>
-            </w:pPr>
-            <w:r>
-              <w:rPr>
-                <w:rFonts w:ascii="Arial" w:hAnsi="Arial" w:cs="Arial" w:hint="eastAsia"/>
+              <w:end w:val="single" w:sz="2" w:space="0" w:color="000000"/>
+            </w:tcBorders>
+            <w:vAlign w:val="center"/>
+          </w:tcPr>
+          <w:p>
+            <w:pPr>
+              <w:pStyle w:val="Normal"/>
+              <w:rPr>
+                <w:rFonts w:ascii="Arial" w:hAnsi="Arial" w:cs="Arial"/>
+              </w:rPr>
+            </w:pPr>
+            <w:r>
+              <w:rPr>
+                <w:rFonts w:cs="Arial" w:hint="eastAsia" w:ascii="Arial" w:hAnsi="Arial"/>
               </w:rPr>
               <w:t xml:space="preserve">Reviewed by </w:t>
             </w:r>
@@ -237,21 +246,22 @@
             <w:gridSpan w:val="3"/>
             <w:tcBorders>
               <w:top w:val="single" w:sz="2" w:space="0" w:color="000000"/>
-              <w:left w:val="single" w:sz="2" w:space="0" w:color="000000"/>
+              <w:start w:val="single" w:sz="2" w:space="0" w:color="000000"/>
               <w:bottom w:val="single" w:sz="2" w:space="0" w:color="000000"/>
-              <w:right w:val="single" w:sz="2" w:space="0" w:color="000000"/>
-            </w:tcBorders>
-            <w:vAlign w:val="center"/>
-          </w:tcPr>
-          <w:p>
-            <w:pPr>
-              <w:rPr>
-                <w:rFonts w:ascii="Arial" w:hAnsi="Arial" w:cs="Arial"/>
-              </w:rPr>
-            </w:pPr>
-            <w:r>
-              <w:rPr>
-                <w:rFonts w:ascii="Arial" w:hAnsi="Arial" w:cs="Arial" w:hint="eastAsia"/>
+              <w:end w:val="single" w:sz="2" w:space="0" w:color="000000"/>
+            </w:tcBorders>
+            <w:vAlign w:val="center"/>
+          </w:tcPr>
+          <w:p>
+            <w:pPr>
+              <w:pStyle w:val="Normal"/>
+              <w:rPr>
+                <w:rFonts w:ascii="Arial" w:hAnsi="Arial" w:cs="Arial"/>
+              </w:rPr>
+            </w:pPr>
+            <w:r>
+              <w:rPr>
+                <w:rFonts w:cs="Arial" w:hint="eastAsia" w:ascii="Arial" w:hAnsi="Arial"/>
               </w:rPr>
               <w:t xml:space="preserve"> </w:t>
             </w:r>
@@ -262,48 +272,60 @@
             <w:tcW w:w="713" w:type="dxa"/>
             <w:tcBorders>
               <w:top w:val="single" w:sz="2" w:space="0" w:color="000000"/>
-              <w:left w:val="single" w:sz="2" w:space="0" w:color="000000"/>
+              <w:start w:val="single" w:sz="2" w:space="0" w:color="000000"/>
               <w:bottom w:val="single" w:sz="2" w:space="0" w:color="000000"/>
-              <w:right w:val="single" w:sz="2" w:space="0" w:color="000000"/>
-            </w:tcBorders>
-            <w:vAlign w:val="center"/>
-          </w:tcPr>
-          <w:p>
-            <w:pPr>
-              <w:rPr>
-                <w:rFonts w:ascii="Arial" w:hAnsi="Arial" w:cs="Arial"/>
-              </w:rPr>
-            </w:pPr>
+              <w:end w:val="single" w:sz="2" w:space="0" w:color="000000"/>
+            </w:tcBorders>
+            <w:vAlign w:val="center"/>
+          </w:tcPr>
+          <w:p>
+            <w:pPr>
+              <w:pStyle w:val="Normal"/>
+              <w:rPr>
+                <w:rFonts w:ascii="Arial" w:hAnsi="Arial" w:cs="Arial"/>
+              </w:rPr>
+            </w:pPr>
+            <w:r>
+              <w:rPr>
+                <w:rFonts w:cs="Arial" w:ascii="Arial" w:hAnsi="Arial"/>
+              </w:rPr>
+            </w:r>
           </w:p>
         </w:tc>
       </w:tr>
       <w:tr>
         <w:trPr>
-          <w:trHeight w:val="370"/>
+          <w:trHeight w:val="370" w:hRule="atLeast"/>
         </w:trPr>
         <w:tc>
           <w:tcPr>
             <w:tcW w:w="5540" w:type="dxa"/>
             <w:gridSpan w:val="7"/>
-            <w:vMerge/>
+            <w:vMerge w:val="continue"/>
             <w:tcBorders>
               <w:bottom w:val="single" w:sz="2" w:space="0" w:color="000000"/>
-              <w:right w:val="single" w:sz="2" w:space="0" w:color="000000"/>
+              <w:end w:val="single" w:sz="2" w:space="0" w:color="000000"/>
             </w:tcBorders>
             <w:tcMar>
               <w:top w:w="0" w:type="dxa"/>
-              <w:left w:w="108" w:type="dxa"/>
+              <w:start w:w="108" w:type="dxa"/>
               <w:bottom w:w="0" w:type="dxa"/>
-              <w:right w:w="108" w:type="dxa"/>
+              <w:end w:w="108" w:type="dxa"/>
             </w:tcMar>
             <w:vAlign w:val="center"/>
           </w:tcPr>
           <w:p>
             <w:pPr>
-              <w:rPr>
-                <w:rFonts w:ascii="Arial" w:hAnsi="Arial" w:cs="Arial"/>
-              </w:rPr>
-            </w:pPr>
+              <w:pStyle w:val="Normal"/>
+              <w:rPr>
+                <w:rFonts w:ascii="Arial" w:hAnsi="Arial" w:cs="Arial"/>
+              </w:rPr>
+            </w:pPr>
+            <w:r>
+              <w:rPr>
+                <w:rFonts w:cs="Arial" w:ascii="Arial" w:hAnsi="Arial"/>
+              </w:rPr>
+            </w:r>
           </w:p>
         </w:tc>
         <w:tc>
@@ -312,21 +334,22 @@
             <w:gridSpan w:val="2"/>
             <w:tcBorders>
               <w:top w:val="single" w:sz="2" w:space="0" w:color="000000"/>
-              <w:left w:val="single" w:sz="2" w:space="0" w:color="000000"/>
+              <w:start w:val="single" w:sz="2" w:space="0" w:color="000000"/>
               <w:bottom w:val="single" w:sz="2" w:space="0" w:color="000000"/>
-              <w:right w:val="single" w:sz="2" w:space="0" w:color="000000"/>
-            </w:tcBorders>
-            <w:vAlign w:val="center"/>
-          </w:tcPr>
-          <w:p>
-            <w:pPr>
-              <w:rPr>
-                <w:rFonts w:ascii="Arial" w:hAnsi="Arial" w:cs="Arial"/>
-              </w:rPr>
-            </w:pPr>
-            <w:r>
-              <w:rPr>
-                <w:rFonts w:ascii="Arial" w:hAnsi="Arial" w:cs="Arial" w:hint="eastAsia"/>
+              <w:end w:val="single" w:sz="2" w:space="0" w:color="000000"/>
+            </w:tcBorders>
+            <w:vAlign w:val="center"/>
+          </w:tcPr>
+          <w:p>
+            <w:pPr>
+              <w:pStyle w:val="Normal"/>
+              <w:rPr>
+                <w:rFonts w:ascii="Arial" w:hAnsi="Arial" w:cs="Arial"/>
+              </w:rPr>
+            </w:pPr>
+            <w:r>
+              <w:rPr>
+                <w:rFonts w:cs="Arial" w:hint="eastAsia" w:ascii="Arial" w:hAnsi="Arial"/>
               </w:rPr>
               <w:t xml:space="preserve">Approved by </w:t>
             </w:r>
@@ -338,14 +361,15 @@
             <w:gridSpan w:val="3"/>
             <w:tcBorders>
               <w:top w:val="single" w:sz="2" w:space="0" w:color="000000"/>
-              <w:left w:val="single" w:sz="2" w:space="0" w:color="000000"/>
+              <w:start w:val="single" w:sz="2" w:space="0" w:color="000000"/>
               <w:bottom w:val="single" w:sz="2" w:space="0" w:color="000000"/>
-              <w:right w:val="single" w:sz="2" w:space="0" w:color="000000"/>
-            </w:tcBorders>
-            <w:vAlign w:val="center"/>
-          </w:tcPr>
-          <w:p>
-            <w:pPr>
+              <w:end w:val="single" w:sz="2" w:space="0" w:color="000000"/>
+            </w:tcBorders>
+            <w:vAlign w:val="center"/>
+          </w:tcPr>
+          <w:p>
+            <w:pPr>
+              <w:pStyle w:val="Normal"/>
               <w:rPr>
                 <w:rFonts w:ascii="Arial" w:hAnsi="Arial" w:cs="Arial"/>
               </w:rPr>
@@ -354,31 +378,7 @@
               <w:rPr>
                 <w:rFonts w:ascii="Arial" w:hAnsi="Arial" w:cs="Arial" w:hint="eastAsia"/>
               </w:rPr>
-              <w:t>이</w:t>
-            </w:r>
-            <w:r>
-              <w:rPr>
-                <w:rFonts w:ascii="Arial" w:hAnsi="Arial" w:cs="Arial" w:hint="eastAsia"/>
-              </w:rPr>
-              <w:t xml:space="preserve"> </w:t>
-            </w:r>
-            <w:r>
-              <w:rPr>
-                <w:rFonts w:ascii="Arial" w:hAnsi="Arial" w:cs="Arial" w:hint="eastAsia"/>
-              </w:rPr>
-              <w:t>훈</w:t>
-            </w:r>
-            <w:r>
-              <w:rPr>
-                <w:rFonts w:ascii="Arial" w:hAnsi="Arial" w:cs="Arial" w:hint="eastAsia"/>
-              </w:rPr>
-              <w:t xml:space="preserve"> </w:t>
-            </w:r>
-            <w:r>
-              <w:rPr>
-                <w:rFonts w:ascii="Arial" w:hAnsi="Arial" w:cs="Arial" w:hint="eastAsia"/>
-              </w:rPr>
-              <w:t>규</w:t>
+              <w:t>이 훈 규</w:t>
             </w:r>
           </w:p>
         </w:tc>
@@ -387,24 +387,30 @@
             <w:tcW w:w="713" w:type="dxa"/>
             <w:tcBorders>
               <w:top w:val="single" w:sz="2" w:space="0" w:color="000000"/>
-              <w:left w:val="single" w:sz="2" w:space="0" w:color="000000"/>
+              <w:start w:val="single" w:sz="2" w:space="0" w:color="000000"/>
               <w:bottom w:val="single" w:sz="2" w:space="0" w:color="000000"/>
-              <w:right w:val="single" w:sz="2" w:space="0" w:color="000000"/>
-            </w:tcBorders>
-            <w:vAlign w:val="center"/>
-          </w:tcPr>
-          <w:p>
-            <w:pPr>
-              <w:rPr>
-                <w:rFonts w:ascii="Arial" w:hAnsi="Arial" w:cs="Arial"/>
-              </w:rPr>
-            </w:pPr>
+              <w:end w:val="single" w:sz="2" w:space="0" w:color="000000"/>
+            </w:tcBorders>
+            <w:vAlign w:val="center"/>
+          </w:tcPr>
+          <w:p>
+            <w:pPr>
+              <w:pStyle w:val="Normal"/>
+              <w:rPr>
+                <w:rFonts w:ascii="Arial" w:hAnsi="Arial" w:cs="Arial"/>
+              </w:rPr>
+            </w:pPr>
+            <w:r>
+              <w:rPr>
+                <w:rFonts w:cs="Arial" w:ascii="Arial" w:hAnsi="Arial"/>
+              </w:rPr>
+            </w:r>
           </w:p>
         </w:tc>
       </w:tr>
       <w:tr>
         <w:trPr>
-          <w:trHeight w:hRule="exact" w:val="216"/>
+          <w:trHeight w:val="216" w:hRule="exact"/>
         </w:trPr>
         <w:tc>
           <w:tcPr>
@@ -417,10 +423,16 @@
           </w:tcPr>
           <w:p>
             <w:pPr>
-              <w:rPr>
-                <w:rFonts w:ascii="Arial" w:hAnsi="Arial" w:cs="Arial"/>
-              </w:rPr>
-            </w:pPr>
+              <w:pStyle w:val="Normal"/>
+              <w:rPr>
+                <w:rFonts w:ascii="Arial" w:hAnsi="Arial" w:cs="Arial"/>
+              </w:rPr>
+            </w:pPr>
+            <w:r>
+              <w:rPr>
+                <w:rFonts w:cs="Arial" w:ascii="Arial" w:hAnsi="Arial"/>
+              </w:rPr>
+            </w:r>
           </w:p>
         </w:tc>
         <w:tc>
@@ -434,10 +446,16 @@
           </w:tcPr>
           <w:p>
             <w:pPr>
-              <w:rPr>
-                <w:rFonts w:ascii="Arial" w:hAnsi="Arial" w:cs="Arial"/>
-              </w:rPr>
-            </w:pPr>
+              <w:pStyle w:val="Normal"/>
+              <w:rPr>
+                <w:rFonts w:ascii="Arial" w:hAnsi="Arial" w:cs="Arial"/>
+              </w:rPr>
+            </w:pPr>
+            <w:r>
+              <w:rPr>
+                <w:rFonts w:cs="Arial" w:ascii="Arial" w:hAnsi="Arial"/>
+              </w:rPr>
+            </w:r>
           </w:p>
         </w:tc>
         <w:tc>
@@ -451,10 +469,16 @@
           </w:tcPr>
           <w:p>
             <w:pPr>
-              <w:rPr>
-                <w:rFonts w:ascii="Arial" w:hAnsi="Arial" w:cs="Arial"/>
-              </w:rPr>
-            </w:pPr>
+              <w:pStyle w:val="Normal"/>
+              <w:rPr>
+                <w:rFonts w:ascii="Arial" w:hAnsi="Arial" w:cs="Arial"/>
+              </w:rPr>
+            </w:pPr>
+            <w:r>
+              <w:rPr>
+                <w:rFonts w:cs="Arial" w:ascii="Arial" w:hAnsi="Arial"/>
+              </w:rPr>
+            </w:r>
           </w:p>
         </w:tc>
         <w:tc>
@@ -467,16 +491,22 @@
           </w:tcPr>
           <w:p>
             <w:pPr>
-              <w:rPr>
-                <w:rFonts w:ascii="Arial" w:hAnsi="Arial" w:cs="Arial"/>
-              </w:rPr>
-            </w:pPr>
+              <w:pStyle w:val="Normal"/>
+              <w:rPr>
+                <w:rFonts w:ascii="Arial" w:hAnsi="Arial" w:cs="Arial"/>
+              </w:rPr>
+            </w:pPr>
+            <w:r>
+              <w:rPr>
+                <w:rFonts w:cs="Arial" w:ascii="Arial" w:hAnsi="Arial"/>
+              </w:rPr>
+            </w:r>
           </w:p>
         </w:tc>
       </w:tr>
       <w:tr>
         <w:trPr>
-          <w:trHeight w:val="370"/>
+          <w:trHeight w:val="370" w:hRule="atLeast"/>
         </w:trPr>
         <w:tc>
           <w:tcPr>
@@ -489,13 +519,14 @@
           </w:tcPr>
           <w:p>
             <w:pPr>
-              <w:rPr>
-                <w:rFonts w:ascii="Arial" w:hAnsi="Arial" w:cs="Arial"/>
-              </w:rPr>
-            </w:pPr>
-            <w:r>
-              <w:rPr>
-                <w:rFonts w:ascii="Arial" w:hAnsi="Arial" w:cs="Arial" w:hint="eastAsia"/>
+              <w:pStyle w:val="Normal"/>
+              <w:rPr>
+                <w:rFonts w:ascii="Arial" w:hAnsi="Arial" w:cs="Arial"/>
+              </w:rPr>
+            </w:pPr>
+            <w:r>
+              <w:rPr>
+                <w:rFonts w:cs="Arial" w:hint="eastAsia" w:ascii="Arial" w:hAnsi="Arial"/>
               </w:rPr>
               <w:t xml:space="preserve">Department. R&amp;D </w:t>
             </w:r>
@@ -511,10 +542,16 @@
           </w:tcPr>
           <w:p>
             <w:pPr>
-              <w:rPr>
-                <w:rFonts w:ascii="Arial" w:hAnsi="Arial" w:cs="Arial"/>
-              </w:rPr>
-            </w:pPr>
+              <w:pStyle w:val="Normal"/>
+              <w:rPr>
+                <w:rFonts w:ascii="Arial" w:hAnsi="Arial" w:cs="Arial"/>
+              </w:rPr>
+            </w:pPr>
+            <w:r>
+              <w:rPr>
+                <w:rFonts w:cs="Arial" w:ascii="Arial" w:hAnsi="Arial"/>
+              </w:rPr>
+            </w:r>
           </w:p>
         </w:tc>
         <w:tc>
@@ -528,23 +565,16 @@
           </w:tcPr>
           <w:p>
             <w:pPr>
-              <w:rPr>
-                <w:rFonts w:ascii="Arial" w:hAnsi="Arial" w:cs="Arial"/>
-              </w:rPr>
-            </w:pPr>
-            <w:proofErr w:type="gramStart"/>
-            <w:r>
-              <w:rPr>
-                <w:rFonts w:ascii="Arial" w:hAnsi="Arial" w:cs="Arial" w:hint="eastAsia"/>
-              </w:rPr>
-              <w:t>Name :</w:t>
-            </w:r>
-            <w:proofErr w:type="gramEnd"/>
-            <w:r>
-              <w:rPr>
-                <w:rFonts w:ascii="Arial" w:hAnsi="Arial" w:cs="Arial" w:hint="eastAsia"/>
-              </w:rPr>
-              <w:t xml:space="preserve"> </w:t>
+              <w:pStyle w:val="Normal"/>
+              <w:rPr>
+                <w:rFonts w:ascii="Arial" w:hAnsi="Arial" w:cs="Arial"/>
+              </w:rPr>
+            </w:pPr>
+            <w:r>
+              <w:rPr>
+                <w:rFonts w:cs="Arial" w:hint="eastAsia" w:ascii="Arial" w:hAnsi="Arial"/>
+              </w:rPr>
+              <w:t xml:space="preserve">Name : </w:t>
             </w:r>
           </w:p>
         </w:tc>
@@ -559,13 +589,14 @@
           </w:tcPr>
           <w:p>
             <w:pPr>
-              <w:rPr>
-                <w:rFonts w:ascii="Arial" w:hAnsi="Arial" w:cs="Arial"/>
-              </w:rPr>
-            </w:pPr>
-            <w:r>
-              <w:rPr>
-                <w:rFonts w:ascii="Arial" w:hAnsi="Arial" w:cs="Arial"/>
+              <w:pStyle w:val="Normal"/>
+              <w:rPr>
+                <w:rFonts w:ascii="Arial" w:hAnsi="Arial" w:cs="Arial"/>
+              </w:rPr>
+            </w:pPr>
+            <w:r>
+              <w:rPr>
+                <w:rFonts w:cs="Arial" w:ascii="Arial" w:hAnsi="Arial"/>
               </w:rPr>
               <w:t>Jibon</w:t>
             </w:r>
@@ -574,31 +605,49 @@
         <w:tc>
           <w:tcPr>
             <w:tcW w:w="802" w:type="dxa"/>
+            <w:tcBorders/>
             <w:tcMar>
               <w:top w:w="0" w:type="dxa"/>
-              <w:left w:w="108" w:type="dxa"/>
+              <w:start w:w="108" w:type="dxa"/>
               <w:bottom w:w="0" w:type="dxa"/>
-              <w:right w:w="108" w:type="dxa"/>
+              <w:end w:w="108" w:type="dxa"/>
             </w:tcMar>
           </w:tcPr>
-          <w:p/>
+          <w:p>
+            <w:pPr>
+              <w:pStyle w:val="Normal"/>
+              <w:rPr/>
+            </w:pPr>
+            <w:r>
+              <w:rPr/>
+            </w:r>
+          </w:p>
         </w:tc>
         <w:tc>
           <w:tcPr>
             <w:tcW w:w="713" w:type="dxa"/>
+            <w:tcBorders/>
             <w:tcMar>
               <w:top w:w="0" w:type="dxa"/>
-              <w:left w:w="108" w:type="dxa"/>
+              <w:start w:w="108" w:type="dxa"/>
               <w:bottom w:w="0" w:type="dxa"/>
-              <w:right w:w="108" w:type="dxa"/>
+              <w:end w:w="108" w:type="dxa"/>
             </w:tcMar>
           </w:tcPr>
-          <w:p/>
+          <w:p>
+            <w:pPr>
+              <w:pStyle w:val="Normal"/>
+              <w:rPr/>
+            </w:pPr>
+            <w:r>
+              <w:rPr/>
+            </w:r>
+          </w:p>
         </w:tc>
       </w:tr>
       <w:tr>
         <w:trPr>
-          <w:trHeight w:val="370"/>
+          <w:trHeight w:val="370" w:hRule="atLeast"/>
         </w:trPr>
         <w:tc>
           <w:tcPr>
@@ -612,30 +661,23 @@
           </w:tcPr>
           <w:p>
             <w:pPr>
-              <w:rPr>
-                <w:rFonts w:ascii="Arial" w:hAnsi="Arial" w:cs="Arial"/>
-              </w:rPr>
-            </w:pPr>
-            <w:proofErr w:type="gramStart"/>
-            <w:r>
-              <w:rPr>
-                <w:rFonts w:ascii="Arial" w:hAnsi="Arial" w:cs="Arial" w:hint="eastAsia"/>
-              </w:rPr>
-              <w:t>Title :</w:t>
-            </w:r>
-            <w:proofErr w:type="gramEnd"/>
-            <w:r>
-              <w:rPr>
-                <w:rFonts w:ascii="Arial" w:hAnsi="Arial" w:cs="Arial" w:hint="eastAsia"/>
-              </w:rPr>
-              <w:t xml:space="preserve"> Weekly Report  </w:t>
+              <w:pStyle w:val="Normal"/>
+              <w:rPr>
+                <w:rFonts w:ascii="Arial" w:hAnsi="Arial" w:cs="Arial"/>
+              </w:rPr>
+            </w:pPr>
+            <w:r>
+              <w:rPr>
+                <w:rFonts w:cs="Arial" w:hint="eastAsia" w:ascii="Arial" w:hAnsi="Arial"/>
+              </w:rPr>
+              <w:t xml:space="preserve">Title : Weekly Report  </w:t>
             </w:r>
           </w:p>
         </w:tc>
       </w:tr>
       <w:tr>
         <w:trPr>
-          <w:trHeight w:val="370"/>
+          <w:trHeight w:val="370" w:hRule="atLeast"/>
         </w:trPr>
         <w:tc>
           <w:tcPr>
@@ -648,24 +690,17 @@
           </w:tcPr>
           <w:p>
             <w:pPr>
-              <w:rPr>
-                <w:rFonts w:ascii="Arial" w:hAnsi="Arial" w:cs="Arial"/>
-              </w:rPr>
-            </w:pPr>
-            <w:r>
-              <w:rPr>
-                <w:rFonts w:ascii="Arial" w:hAnsi="Arial" w:cs="Arial" w:hint="eastAsia"/>
-              </w:rPr>
-              <w:t xml:space="preserve">Meeting </w:t>
-            </w:r>
-            <w:proofErr w:type="gramStart"/>
-            <w:r>
-              <w:rPr>
-                <w:rFonts w:ascii="Arial" w:hAnsi="Arial" w:cs="Arial" w:hint="eastAsia"/>
-              </w:rPr>
-              <w:t>date :</w:t>
-            </w:r>
-            <w:proofErr w:type="gramEnd"/>
+              <w:pStyle w:val="Normal"/>
+              <w:rPr>
+                <w:rFonts w:ascii="Arial" w:hAnsi="Arial" w:cs="Arial"/>
+              </w:rPr>
+            </w:pPr>
+            <w:r>
+              <w:rPr>
+                <w:rFonts w:cs="Arial" w:hint="eastAsia" w:ascii="Arial" w:hAnsi="Arial"/>
+              </w:rPr>
+              <w:t>Meeting date :</w:t>
+            </w:r>
           </w:p>
         </w:tc>
         <w:tc>
@@ -679,39 +714,46 @@
           </w:tcPr>
           <w:p>
             <w:pPr>
-              <w:rPr>
-                <w:rFonts w:ascii="Arial" w:hAnsi="Arial" w:cs="Arial"/>
-              </w:rPr>
-            </w:pPr>
-            <w:r>
-              <w:rPr>
-                <w:rFonts w:ascii="Arial" w:hAnsi="Arial" w:cs="Arial" w:hint="eastAsia"/>
+              <w:pStyle w:val="Normal"/>
+              <w:rPr>
+                <w:rFonts w:ascii="Arial" w:hAnsi="Arial" w:cs="Arial"/>
+              </w:rPr>
+            </w:pPr>
+            <w:r>
+              <w:rPr>
+                <w:rFonts w:cs="Arial" w:hint="eastAsia" w:ascii="Arial" w:hAnsi="Arial"/>
               </w:rPr>
               <w:t>202</w:t>
             </w:r>
             <w:r>
               <w:rPr>
-                <w:rFonts w:ascii="Arial" w:hAnsi="Arial" w:cs="Arial"/>
+                <w:rFonts w:cs="Arial" w:ascii="Arial" w:hAnsi="Arial"/>
               </w:rPr>
               <w:t>6</w:t>
             </w:r>
             <w:r>
               <w:rPr>
-                <w:rFonts w:ascii="Arial" w:hAnsi="Arial" w:cs="Arial" w:hint="eastAsia"/>
+                <w:rFonts w:cs="Arial" w:hint="eastAsia" w:ascii="Arial" w:hAnsi="Arial"/>
               </w:rPr>
               <w:t>-</w:t>
             </w:r>
             <w:r>
               <w:rPr>
-                <w:rFonts w:ascii="Arial" w:hAnsi="Arial" w:cs="Arial"/>
+                <w:rFonts w:cs="Arial" w:ascii="Arial" w:hAnsi="Arial"/>
               </w:rPr>
               <w:t>May</w:t>
             </w:r>
             <w:r>
               <w:rPr>
-                <w:rFonts w:ascii="Arial" w:hAnsi="Arial" w:cs="Arial" w:hint="eastAsia"/>
+                <w:rFonts w:cs="Arial" w:hint="eastAsia" w:ascii="Arial" w:hAnsi="Arial"/>
               </w:rPr>
               <w:t>-</w:t>
+            </w:r>
+            <w:r>
+              <w:rPr>
+                <w:rFonts w:cs="Arial" w:hint="eastAsia" w:ascii="Arial" w:hAnsi="Arial"/>
+              </w:rPr>
+              <w:t>11</w:t>
             </w:r>
           </w:p>
         </w:tc>
@@ -727,13 +769,14 @@
           </w:tcPr>
           <w:p>
             <w:pPr>
-              <w:rPr>
-                <w:rFonts w:ascii="Arial" w:hAnsi="Arial" w:cs="Arial"/>
-              </w:rPr>
-            </w:pPr>
-            <w:r>
-              <w:rPr>
-                <w:rFonts w:ascii="Arial" w:hAnsi="Arial" w:cs="Arial" w:hint="eastAsia"/>
+              <w:pStyle w:val="Normal"/>
+              <w:rPr>
+                <w:rFonts w:ascii="Arial" w:hAnsi="Arial" w:cs="Arial"/>
+              </w:rPr>
+            </w:pPr>
+            <w:r>
+              <w:rPr>
+                <w:rFonts w:cs="Arial" w:hint="eastAsia" w:ascii="Arial" w:hAnsi="Arial"/>
               </w:rPr>
               <w:t xml:space="preserve">Working Duration </w:t>
             </w:r>
@@ -751,39 +794,34 @@
           </w:tcPr>
           <w:p>
             <w:pPr>
-              <w:rPr>
-                <w:rFonts w:ascii="Arial" w:hAnsi="Arial" w:cs="Arial"/>
-              </w:rPr>
-            </w:pPr>
-            <w:r>
-              <w:rPr>
-                <w:rFonts w:ascii="Arial" w:hAnsi="Arial" w:cs="Arial" w:hint="eastAsia"/>
+              <w:pStyle w:val="Normal"/>
+              <w:rPr>
+                <w:rFonts w:ascii="Arial" w:hAnsi="Arial" w:cs="Arial"/>
+              </w:rPr>
+            </w:pPr>
+            <w:r>
+              <w:rPr>
+                <w:rFonts w:cs="Arial" w:hint="eastAsia" w:ascii="Arial" w:hAnsi="Arial"/>
               </w:rPr>
               <w:t>2026-</w:t>
             </w:r>
             <w:r>
               <w:rPr>
-                <w:rFonts w:ascii="Arial" w:hAnsi="Arial" w:cs="Arial"/>
+                <w:rFonts w:cs="Arial" w:ascii="Arial" w:hAnsi="Arial"/>
               </w:rPr>
               <w:t>Apr</w:t>
             </w:r>
             <w:r>
               <w:rPr>
-                <w:rFonts w:ascii="Arial" w:hAnsi="Arial" w:cs="Arial" w:hint="eastAsia"/>
+                <w:rFonts w:cs="Arial" w:hint="eastAsia" w:ascii="Arial" w:hAnsi="Arial"/>
               </w:rPr>
               <w:t>-</w:t>
             </w:r>
             <w:r>
               <w:rPr>
-                <w:rFonts w:ascii="Arial" w:hAnsi="Arial" w:cs="Arial"/>
-              </w:rPr>
-              <w:t>2</w:t>
-            </w:r>
-            <w:r>
-              <w:rPr>
-                <w:rFonts w:ascii="Arial" w:hAnsi="Arial" w:cs="Arial"/>
-              </w:rPr>
-              <w:t>7</w:t>
+                <w:rFonts w:cs="Arial" w:ascii="Arial" w:hAnsi="Arial"/>
+              </w:rPr>
+              <w:t>27</w:t>
             </w:r>
           </w:p>
         </w:tc>
@@ -799,6 +837,7 @@
           </w:tcPr>
           <w:p>
             <w:pPr>
+              <w:pStyle w:val="Normal"/>
               <w:rPr>
                 <w:rFonts w:ascii="Arial" w:hAnsi="Arial" w:cs="Arial"/>
               </w:rPr>
@@ -823,34 +862,41 @@
           </w:tcPr>
           <w:p>
             <w:pPr>
-              <w:rPr>
-                <w:rFonts w:ascii="Arial" w:hAnsi="Arial" w:cs="Arial"/>
-              </w:rPr>
-            </w:pPr>
-            <w:r>
-              <w:rPr>
-                <w:rFonts w:ascii="Arial" w:hAnsi="Arial" w:cs="Arial" w:hint="eastAsia"/>
+              <w:pStyle w:val="Normal"/>
+              <w:rPr>
+                <w:rFonts w:ascii="Arial" w:hAnsi="Arial" w:cs="Arial"/>
+              </w:rPr>
+            </w:pPr>
+            <w:r>
+              <w:rPr>
+                <w:rFonts w:cs="Arial" w:hint="eastAsia" w:ascii="Arial" w:hAnsi="Arial"/>
               </w:rPr>
               <w:t>2026-</w:t>
             </w:r>
             <w:r>
               <w:rPr>
-                <w:rFonts w:ascii="Arial" w:hAnsi="Arial" w:cs="Arial"/>
-              </w:rPr>
-              <w:t>Apr-</w:t>
-            </w:r>
-            <w:r>
-              <w:rPr>
-                <w:rFonts w:ascii="Arial" w:hAnsi="Arial" w:cs="Arial"/>
-              </w:rPr>
-              <w:t>30</w:t>
+                <w:rFonts w:cs="Arial" w:hint="eastAsia" w:ascii="Arial" w:hAnsi="Arial"/>
+              </w:rPr>
+              <w:t>May</w:t>
+            </w:r>
+            <w:r>
+              <w:rPr>
+                <w:rFonts w:cs="Arial" w:ascii="Arial" w:hAnsi="Arial"/>
+              </w:rPr>
+              <w:t>-</w:t>
+            </w:r>
+            <w:r>
+              <w:rPr>
+                <w:rFonts w:cs="Arial" w:ascii="Arial" w:hAnsi="Arial"/>
+              </w:rPr>
+              <w:t>08</w:t>
             </w:r>
           </w:p>
         </w:tc>
       </w:tr>
       <w:tr>
         <w:trPr>
-          <w:trHeight w:val="256"/>
+          <w:trHeight w:val="256" w:hRule="atLeast"/>
         </w:trPr>
         <w:tc>
           <w:tcPr>
@@ -863,6 +909,7 @@
           </w:tcPr>
           <w:p>
             <w:pPr>
+              <w:pStyle w:val="Normal"/>
               <w:rPr>
                 <w:rFonts w:ascii="Arial" w:hAnsi="Arial" w:cs="Arial"/>
               </w:rPr>
@@ -871,19 +918,7 @@
               <w:rPr>
                 <w:rFonts w:ascii="Arial" w:hAnsi="Arial" w:cs="Arial" w:hint="eastAsia"/>
               </w:rPr>
-              <w:t>보고</w:t>
-            </w:r>
-            <w:r>
-              <w:rPr>
-                <w:rFonts w:ascii="Arial" w:hAnsi="Arial" w:cs="Arial" w:hint="eastAsia"/>
-              </w:rPr>
-              <w:t xml:space="preserve"> </w:t>
-            </w:r>
-            <w:r>
-              <w:rPr>
-                <w:rFonts w:ascii="Arial" w:hAnsi="Arial" w:cs="Arial" w:hint="eastAsia"/>
-              </w:rPr>
-              <w:t>내용</w:t>
+              <w:t>보고 내용</w:t>
             </w:r>
           </w:p>
         </w:tc>
@@ -891,44 +926,55 @@
     </w:tbl>
     <w:p>
       <w:pPr>
+        <w:pStyle w:val="Normal"/>
         <w:rPr>
           <w:rFonts w:ascii="Arial" w:hAnsi="Arial" w:cs="Arial"/>
         </w:rPr>
       </w:pPr>
+      <w:r>
+        <w:rPr>
+          <w:rFonts w:cs="Arial" w:ascii="Arial" w:hAnsi="Arial"/>
+        </w:rPr>
+      </w:r>
     </w:p>
     <w:tbl>
       <w:tblPr>
         <w:tblW w:w="9060" w:type="dxa"/>
+        <w:jc w:val="start"/>
+        <w:tblInd w:w="0" w:type="dxa"/>
         <w:tblLayout w:type="fixed"/>
         <w:tblCellMar>
-          <w:left w:w="99" w:type="dxa"/>
-          <w:right w:w="99" w:type="dxa"/>
+          <w:top w:w="0" w:type="dxa"/>
+          <w:start w:w="99" w:type="dxa"/>
+          <w:bottom w:w="0" w:type="dxa"/>
+          <w:end w:w="99" w:type="dxa"/>
         </w:tblCellMar>
-        <w:tblLook w:val="04A0" w:firstRow="1" w:lastRow="0" w:firstColumn="1" w:lastColumn="0" w:noHBand="0" w:noVBand="1"/>
+        <w:tblLook w:val="04a0" w:noVBand="1" w:noHBand="0" w:lastColumn="0" w:firstColumn="1" w:lastRow="0" w:firstRow="1"/>
       </w:tblPr>
       <w:tblGrid>
         <w:gridCol w:w="1378"/>
-        <w:gridCol w:w="5380"/>
-        <w:gridCol w:w="1440"/>
+        <w:gridCol w:w="5379"/>
+        <w:gridCol w:w="1441"/>
         <w:gridCol w:w="862"/>
       </w:tblGrid>
       <w:tr>
         <w:trPr>
-          <w:trHeight w:val="282"/>
+          <w:trHeight w:val="282" w:hRule="atLeast"/>
         </w:trPr>
         <w:tc>
           <w:tcPr>
             <w:tcW w:w="1378" w:type="dxa"/>
             <w:tcBorders>
               <w:top w:val="single" w:sz="4" w:space="0" w:color="000000"/>
-              <w:left w:val="single" w:sz="4" w:space="0" w:color="000000"/>
+              <w:start w:val="single" w:sz="4" w:space="0" w:color="000000"/>
               <w:bottom w:val="single" w:sz="4" w:space="0" w:color="000000"/>
-              <w:right w:val="single" w:sz="4" w:space="0" w:color="000000"/>
-            </w:tcBorders>
-            <w:vAlign w:val="center"/>
-          </w:tcPr>
-          <w:p>
-            <w:pPr>
+              <w:end w:val="single" w:sz="4" w:space="0" w:color="000000"/>
+            </w:tcBorders>
+            <w:vAlign w:val="center"/>
+          </w:tcPr>
+          <w:p>
+            <w:pPr>
+              <w:pStyle w:val="Normal"/>
               <w:rPr>
                 <w:rFonts w:ascii="Arial" w:hAnsi="Arial" w:cs="Arial"/>
                 <w:b/>
@@ -937,7 +983,7 @@
             </w:pPr>
             <w:r>
               <w:rPr>
-                <w:rFonts w:ascii="Arial" w:hAnsi="Arial" w:cs="Arial"/>
+                <w:rFonts w:cs="Arial" w:ascii="Arial" w:hAnsi="Arial"/>
                 <w:b/>
                 <w:bCs/>
               </w:rPr>
@@ -947,15 +993,16 @@
         </w:tc>
         <w:tc>
           <w:tcPr>
-            <w:tcW w:w="5380" w:type="dxa"/>
+            <w:tcW w:w="5379" w:type="dxa"/>
             <w:tcBorders>
               <w:top w:val="single" w:sz="4" w:space="0" w:color="000000"/>
               <w:bottom w:val="single" w:sz="4" w:space="0" w:color="000000"/>
-              <w:right w:val="single" w:sz="4" w:space="0" w:color="000000"/>
-            </w:tcBorders>
-          </w:tcPr>
-          <w:p>
-            <w:pPr>
+              <w:end w:val="single" w:sz="4" w:space="0" w:color="000000"/>
+            </w:tcBorders>
+          </w:tcPr>
+          <w:p>
+            <w:pPr>
+              <w:pStyle w:val="Normal"/>
               <w:rPr>
                 <w:rFonts w:ascii="Arial" w:hAnsi="Arial" w:cs="Arial"/>
                 <w:b/>
@@ -964,7 +1011,7 @@
             </w:pPr>
             <w:r>
               <w:rPr>
-                <w:rFonts w:ascii="Arial" w:hAnsi="Arial" w:cs="Arial"/>
+                <w:rFonts w:cs="Arial" w:ascii="Arial" w:hAnsi="Arial"/>
                 <w:b/>
                 <w:bCs/>
               </w:rPr>
@@ -974,15 +1021,16 @@
         </w:tc>
         <w:tc>
           <w:tcPr>
-            <w:tcW w:w="1440" w:type="dxa"/>
+            <w:tcW w:w="1441" w:type="dxa"/>
             <w:tcBorders>
               <w:top w:val="single" w:sz="4" w:space="0" w:color="000000"/>
               <w:bottom w:val="single" w:sz="4" w:space="0" w:color="000000"/>
-              <w:right w:val="single" w:sz="4" w:space="0" w:color="000000"/>
-            </w:tcBorders>
-          </w:tcPr>
-          <w:p>
-            <w:pPr>
+              <w:end w:val="single" w:sz="4" w:space="0" w:color="000000"/>
+            </w:tcBorders>
+          </w:tcPr>
+          <w:p>
+            <w:pPr>
+              <w:pStyle w:val="Normal"/>
               <w:rPr>
                 <w:rFonts w:ascii="Arial" w:hAnsi="Arial" w:cs="Arial"/>
                 <w:b/>
@@ -991,7 +1039,7 @@
             </w:pPr>
             <w:r>
               <w:rPr>
-                <w:rFonts w:ascii="Arial" w:hAnsi="Arial" w:cs="Arial"/>
+                <w:rFonts w:cs="Arial" w:ascii="Arial" w:hAnsi="Arial"/>
                 <w:b/>
                 <w:bCs/>
               </w:rPr>
@@ -1005,12 +1053,13 @@
             <w:tcBorders>
               <w:top w:val="single" w:sz="4" w:space="0" w:color="000000"/>
               <w:bottom w:val="single" w:sz="4" w:space="0" w:color="000000"/>
-              <w:right w:val="single" w:sz="4" w:space="0" w:color="000000"/>
-            </w:tcBorders>
-            <w:vAlign w:val="center"/>
-          </w:tcPr>
-          <w:p>
-            <w:pPr>
+              <w:end w:val="single" w:sz="4" w:space="0" w:color="000000"/>
+            </w:tcBorders>
+            <w:vAlign w:val="center"/>
+          </w:tcPr>
+          <w:p>
+            <w:pPr>
+              <w:pStyle w:val="Normal"/>
               <w:rPr>
                 <w:rFonts w:ascii="Arial" w:hAnsi="Arial" w:cs="Arial"/>
                 <w:b/>
@@ -1019,7 +1068,7 @@
             </w:pPr>
             <w:r>
               <w:rPr>
-                <w:rFonts w:ascii="Arial" w:hAnsi="Arial" w:cs="Arial"/>
+                <w:rFonts w:cs="Arial" w:ascii="Arial" w:hAnsi="Arial"/>
                 <w:b/>
                 <w:bCs/>
               </w:rPr>
@@ -1030,21 +1079,22 @@
       </w:tr>
       <w:tr>
         <w:trPr>
-          <w:trHeight w:val="2528"/>
+          <w:trHeight w:val="2528" w:hRule="atLeast"/>
         </w:trPr>
         <w:tc>
           <w:tcPr>
             <w:tcW w:w="1378" w:type="dxa"/>
             <w:tcBorders>
               <w:top w:val="single" w:sz="4" w:space="0" w:color="000000"/>
-              <w:left w:val="single" w:sz="4" w:space="0" w:color="000000"/>
+              <w:start w:val="single" w:sz="4" w:space="0" w:color="000000"/>
               <w:bottom w:val="single" w:sz="4" w:space="0" w:color="000000"/>
-              <w:right w:val="single" w:sz="4" w:space="0" w:color="000000"/>
-            </w:tcBorders>
-            <w:vAlign w:val="center"/>
-          </w:tcPr>
-          <w:p>
-            <w:pPr>
+              <w:end w:val="single" w:sz="4" w:space="0" w:color="000000"/>
+            </w:tcBorders>
+            <w:vAlign w:val="center"/>
+          </w:tcPr>
+          <w:p>
+            <w:pPr>
+              <w:pStyle w:val="Normal"/>
               <w:jc w:val="center"/>
               <w:rPr>
                 <w:rFonts w:ascii="Arial" w:hAnsi="Arial" w:cs="Arial"/>
@@ -1056,7 +1106,7 @@
             </w:pPr>
             <w:r>
               <w:rPr>
-                <w:rFonts w:ascii="Arial" w:hAnsi="Arial" w:cs="Arial"/>
+                <w:rFonts w:cs="Arial" w:ascii="Arial" w:hAnsi="Arial"/>
                 <w:b/>
                 <w:bCs/>
                 <w:sz w:val="16"/>
@@ -1068,17 +1118,17 @@
         </w:tc>
         <w:tc>
           <w:tcPr>
-            <w:tcW w:w="5380" w:type="dxa"/>
+            <w:tcW w:w="5379" w:type="dxa"/>
             <w:tcBorders>
               <w:top w:val="single" w:sz="4" w:space="0" w:color="000000"/>
               <w:bottom w:val="single" w:sz="4" w:space="0" w:color="000000"/>
-              <w:right w:val="single" w:sz="4" w:space="0" w:color="000000"/>
+              <w:end w:val="single" w:sz="4" w:space="0" w:color="000000"/>
             </w:tcBorders>
           </w:tcPr>
           <w:p>
             <w:pPr>
               <w:pStyle w:val="ListParagraph"/>
-              <w:ind w:leftChars="0" w:left="0"/>
+              <w:ind w:startChars="0" w:start="0"/>
               <w:rPr>
                 <w:rFonts w:ascii="Arial" w:hAnsi="Arial" w:cs="Arial"/>
                 <w:sz w:val="22"/>
@@ -1086,7 +1136,7 @@
             </w:pPr>
             <w:r>
               <w:rPr>
-                <w:rFonts w:ascii="Arial" w:hAnsi="Arial" w:cs="Arial"/>
+                <w:rFonts w:cs="Arial" w:ascii="Arial" w:hAnsi="Arial"/>
                 <w:sz w:val="16"/>
                 <w:szCs w:val="16"/>
               </w:rPr>
@@ -1098,34 +1148,119 @@
               <w:pStyle w:val="ListParagraph"/>
               <w:numPr>
                 <w:ilvl w:val="0"/>
-                <w:numId w:val="3"/>
+                <w:numId w:val="1"/>
               </w:numPr>
-              <w:ind w:leftChars="0"/>
+              <w:ind w:startChars="0" w:start="400"/>
               <w:rPr>
                 <w:rFonts w:ascii="Arial" w:hAnsi="Arial" w:cs="Arial"/>
                 <w:sz w:val="16"/>
                 <w:szCs w:val="16"/>
               </w:rPr>
             </w:pPr>
-          </w:p>
-        </w:tc>
-        <w:tc>
-          <w:tcPr>
-            <w:tcW w:w="1440" w:type="dxa"/>
+            <w:r>
+              <w:rPr>
+                <w:rFonts w:cs="Arial" w:ascii="Arial" w:hAnsi="Arial"/>
+                <w:sz w:val="16"/>
+                <w:szCs w:val="16"/>
+              </w:rPr>
+              <w:t xml:space="preserve">Bluetooth Integration Report completed </w:t>
+            </w:r>
+          </w:p>
+          <w:p>
+            <w:pPr>
+              <w:pStyle w:val="ListParagraph"/>
+              <w:numPr>
+                <w:ilvl w:val="0"/>
+                <w:numId w:val="1"/>
+              </w:numPr>
+              <w:ind w:startChars="0" w:start="400"/>
+              <w:rPr>
+                <w:rFonts w:ascii="Arial" w:hAnsi="Arial" w:cs="Arial"/>
+                <w:sz w:val="16"/>
+                <w:szCs w:val="16"/>
+              </w:rPr>
+            </w:pPr>
+            <w:r>
+              <w:rPr>
+                <w:rFonts w:cs="Arial" w:ascii="Arial" w:hAnsi="Arial"/>
+                <w:sz w:val="16"/>
+                <w:szCs w:val="16"/>
+              </w:rPr>
+              <w:t>Added Security Layer for Bluetooth Easy Connectivity.</w:t>
+            </w:r>
+          </w:p>
+          <w:p>
+            <w:pPr>
+              <w:pStyle w:val="ListParagraph"/>
+              <w:numPr>
+                <w:ilvl w:val="0"/>
+                <w:numId w:val="1"/>
+              </w:numPr>
+              <w:ind w:startChars="0" w:start="400"/>
+              <w:rPr>
+                <w:rFonts w:ascii="Arial" w:hAnsi="Arial" w:cs="Arial"/>
+                <w:sz w:val="16"/>
+                <w:szCs w:val="16"/>
+              </w:rPr>
+            </w:pPr>
+            <w:r>
+              <w:rPr>
+                <w:rFonts w:cs="Arial" w:ascii="Arial" w:hAnsi="Arial"/>
+                <w:sz w:val="16"/>
+                <w:szCs w:val="16"/>
+              </w:rPr>
+              <w:t>Tested Bluetooth connection With Cardioffice Application</w:t>
+            </w:r>
+          </w:p>
+          <w:p>
+            <w:pPr>
+              <w:pStyle w:val="ListParagraph"/>
+              <w:numPr>
+                <w:ilvl w:val="0"/>
+                <w:numId w:val="1"/>
+              </w:numPr>
+              <w:ind w:startChars="0" w:start="400"/>
+              <w:rPr>
+                <w:rFonts w:ascii="Arial" w:hAnsi="Arial" w:cs="Arial"/>
+                <w:sz w:val="16"/>
+                <w:szCs w:val="16"/>
+              </w:rPr>
+            </w:pPr>
+            <w:r>
+              <w:rPr>
+                <w:rFonts w:cs="Arial" w:ascii="Arial" w:hAnsi="Arial"/>
+                <w:sz w:val="16"/>
+                <w:szCs w:val="16"/>
+              </w:rPr>
+              <w:t>Tested Stress ECG and received Signals through Cardioffice.</w:t>
+            </w:r>
+          </w:p>
+        </w:tc>
+        <w:tc>
+          <w:tcPr>
+            <w:tcW w:w="1441" w:type="dxa"/>
             <w:tcBorders>
               <w:top w:val="single" w:sz="4" w:space="0" w:color="000000"/>
               <w:bottom w:val="single" w:sz="4" w:space="0" w:color="000000"/>
-              <w:right w:val="single" w:sz="4" w:space="0" w:color="000000"/>
-            </w:tcBorders>
-          </w:tcPr>
-          <w:p>
-            <w:pPr>
+              <w:end w:val="single" w:sz="4" w:space="0" w:color="000000"/>
+            </w:tcBorders>
+          </w:tcPr>
+          <w:p>
+            <w:pPr>
+              <w:pStyle w:val="Normal"/>
               <w:rPr>
                 <w:rFonts w:ascii="Arial" w:hAnsi="Arial" w:cs="Arial"/>
                 <w:sz w:val="16"/>
                 <w:szCs w:val="16"/>
               </w:rPr>
             </w:pPr>
+            <w:r>
+              <w:rPr>
+                <w:rFonts w:cs="Arial" w:ascii="Arial" w:hAnsi="Arial"/>
+                <w:sz w:val="16"/>
+                <w:szCs w:val="16"/>
+              </w:rPr>
+            </w:r>
           </w:p>
         </w:tc>
         <w:tc>
@@ -1134,12 +1269,13 @@
             <w:tcBorders>
               <w:top w:val="single" w:sz="4" w:space="0" w:color="000000"/>
               <w:bottom w:val="single" w:sz="4" w:space="0" w:color="000000"/>
-              <w:right w:val="single" w:sz="4" w:space="0" w:color="000000"/>
-            </w:tcBorders>
-            <w:vAlign w:val="center"/>
-          </w:tcPr>
-          <w:p>
-            <w:pPr>
+              <w:end w:val="single" w:sz="4" w:space="0" w:color="000000"/>
+            </w:tcBorders>
+            <w:vAlign w:val="center"/>
+          </w:tcPr>
+          <w:p>
+            <w:pPr>
+              <w:pStyle w:val="Normal"/>
               <w:rPr>
                 <w:rFonts w:ascii="Arial" w:hAnsi="Arial" w:cs="Arial"/>
                 <w:b/>
@@ -1148,36 +1284,37 @@
                 <w:szCs w:val="16"/>
               </w:rPr>
             </w:pPr>
-          </w:p>
-        </w:tc>
-      </w:tr>
-      <w:tr>
-        <w:trPr>
-          <w:trHeight w:val="2317"/>
-        </w:trPr>
-        <w:tc>
-          <w:tcPr>
-            <w:tcW w:w="1378" w:type="dxa"/>
-            <w:tcBorders>
-              <w:top w:val="single" w:sz="4" w:space="0" w:color="000000"/>
-              <w:left w:val="single" w:sz="4" w:space="0" w:color="000000"/>
-              <w:bottom w:val="single" w:sz="4" w:space="0" w:color="000000"/>
-              <w:right w:val="single" w:sz="4" w:space="0" w:color="000000"/>
-            </w:tcBorders>
-            <w:vAlign w:val="center"/>
-          </w:tcPr>
-          <w:p>
-            <w:pPr>
-              <w:jc w:val="center"/>
-              <w:rPr>
-                <w:rFonts w:ascii="Arial" w:hAnsi="Arial" w:cs="Arial"/>
+            <w:r>
+              <w:rPr>
+                <w:rFonts w:cs="Arial" w:ascii="Arial" w:hAnsi="Arial"/>
                 <w:b/>
                 <w:bCs/>
                 <w:sz w:val="16"/>
                 <w:szCs w:val="16"/>
               </w:rPr>
-            </w:pPr>
-            <w:r>
+            </w:r>
+          </w:p>
+        </w:tc>
+      </w:tr>
+      <w:tr>
+        <w:trPr>
+          <w:trHeight w:val="2317" w:hRule="atLeast"/>
+        </w:trPr>
+        <w:tc>
+          <w:tcPr>
+            <w:tcW w:w="1378" w:type="dxa"/>
+            <w:tcBorders>
+              <w:top w:val="single" w:sz="4" w:space="0" w:color="000000"/>
+              <w:start w:val="single" w:sz="4" w:space="0" w:color="000000"/>
+              <w:bottom w:val="single" w:sz="4" w:space="0" w:color="000000"/>
+              <w:end w:val="single" w:sz="4" w:space="0" w:color="000000"/>
+            </w:tcBorders>
+            <w:vAlign w:val="center"/>
+          </w:tcPr>
+          <w:p>
+            <w:pPr>
+              <w:pStyle w:val="Normal"/>
+              <w:jc w:val="center"/>
               <w:rPr>
                 <w:rFonts w:ascii="Arial" w:hAnsi="Arial" w:cs="Arial"/>
                 <w:b/>
@@ -1185,139 +1322,157 @@
                 <w:sz w:val="16"/>
                 <w:szCs w:val="16"/>
               </w:rPr>
-              <w:t>2</w:t>
-            </w:r>
-          </w:p>
-        </w:tc>
-        <w:tc>
-          <w:tcPr>
-            <w:tcW w:w="5380" w:type="dxa"/>
-            <w:tcBorders>
-              <w:top w:val="single" w:sz="4" w:space="0" w:color="000000"/>
-              <w:bottom w:val="single" w:sz="4" w:space="0" w:color="000000"/>
-              <w:right w:val="single" w:sz="4" w:space="0" w:color="000000"/>
-            </w:tcBorders>
-          </w:tcPr>
-          <w:p>
-            <w:pPr>
-              <w:pStyle w:val="ListParagraph"/>
-              <w:numPr>
-                <w:ilvl w:val="0"/>
-                <w:numId w:val="5"/>
-              </w:numPr>
-              <w:ind w:leftChars="0"/>
-              <w:jc w:val="left"/>
-              <w:rPr>
-                <w:rFonts w:ascii="Arial" w:hAnsi="Arial" w:cs="Arial"/>
-                <w:sz w:val="22"/>
-              </w:rPr>
-            </w:pPr>
-            <w:r>
-              <w:rPr>
-                <w:rFonts w:ascii="Arial" w:hAnsi="Arial" w:cs="Arial"/>
-                <w:sz w:val="22"/>
-              </w:rPr>
-              <w:t>Testing Thermal Printer and Sorting out the issues.</w:t>
-            </w:r>
-          </w:p>
-          <w:p>
-            <w:pPr>
-              <w:pStyle w:val="ListParagraph"/>
-              <w:numPr>
-                <w:ilvl w:val="0"/>
-                <w:numId w:val="5"/>
-              </w:numPr>
-              <w:ind w:leftChars="0"/>
-              <w:jc w:val="left"/>
-              <w:rPr>
-                <w:rFonts w:ascii="Arial" w:hAnsi="Arial" w:cs="Arial"/>
-                <w:sz w:val="22"/>
-              </w:rPr>
-            </w:pPr>
-            <w:r>
-              <w:rPr>
-                <w:rFonts w:ascii="Arial" w:hAnsi="Arial" w:cs="Arial"/>
-                <w:sz w:val="22"/>
-              </w:rPr>
-              <w:t>Alignment is not the initial problem.</w:t>
-            </w:r>
-          </w:p>
-          <w:p>
-            <w:pPr>
-              <w:pStyle w:val="ListParagraph"/>
-              <w:numPr>
-                <w:ilvl w:val="0"/>
-                <w:numId w:val="5"/>
-              </w:numPr>
-              <w:ind w:leftChars="0"/>
-              <w:jc w:val="left"/>
-              <w:rPr>
-                <w:rFonts w:ascii="Arial" w:hAnsi="Arial" w:cs="Arial"/>
-                <w:sz w:val="22"/>
-              </w:rPr>
-            </w:pPr>
-          </w:p>
-        </w:tc>
-        <w:tc>
-          <w:tcPr>
-            <w:tcW w:w="1440" w:type="dxa"/>
-            <w:tcBorders>
-              <w:top w:val="single" w:sz="4" w:space="0" w:color="000000"/>
-              <w:bottom w:val="single" w:sz="4" w:space="0" w:color="000000"/>
-              <w:right w:val="single" w:sz="4" w:space="0" w:color="000000"/>
-            </w:tcBorders>
-          </w:tcPr>
-          <w:p>
-            <w:pPr>
-              <w:rPr>
-                <w:rFonts w:ascii="Arial" w:hAnsi="Arial" w:cs="Arial"/>
-                <w:sz w:val="16"/>
-                <w:szCs w:val="16"/>
-              </w:rPr>
-            </w:pPr>
-          </w:p>
-        </w:tc>
-        <w:tc>
-          <w:tcPr>
-            <w:tcW w:w="862" w:type="dxa"/>
-            <w:tcBorders>
-              <w:top w:val="single" w:sz="4" w:space="0" w:color="000000"/>
-              <w:bottom w:val="single" w:sz="4" w:space="0" w:color="000000"/>
-              <w:right w:val="single" w:sz="4" w:space="0" w:color="000000"/>
-            </w:tcBorders>
-            <w:vAlign w:val="center"/>
-          </w:tcPr>
-          <w:p>
-            <w:pPr>
-              <w:rPr>
-                <w:rFonts w:ascii="Arial" w:hAnsi="Arial" w:cs="Arial"/>
+            </w:pPr>
+            <w:r>
+              <w:rPr>
+                <w:rFonts w:cs="Arial" w:ascii="Arial" w:hAnsi="Arial"/>
                 <w:b/>
                 <w:bCs/>
                 <w:sz w:val="16"/>
                 <w:szCs w:val="16"/>
               </w:rPr>
-            </w:pPr>
-          </w:p>
-        </w:tc>
-      </w:tr>
-      <w:tr>
-        <w:trPr>
-          <w:trHeight w:val="2609"/>
-        </w:trPr>
-        <w:tc>
-          <w:tcPr>
-            <w:tcW w:w="1378" w:type="dxa"/>
+              <w:t>2</w:t>
+            </w:r>
+          </w:p>
+        </w:tc>
+        <w:tc>
+          <w:tcPr>
+            <w:tcW w:w="5379" w:type="dxa"/>
             <w:tcBorders>
               <w:top w:val="single" w:sz="4" w:space="0" w:color="000000"/>
-              <w:left w:val="single" w:sz="4" w:space="0" w:color="000000"/>
               <w:bottom w:val="single" w:sz="4" w:space="0" w:color="000000"/>
-              <w:right w:val="single" w:sz="4" w:space="0" w:color="000000"/>
-            </w:tcBorders>
-            <w:vAlign w:val="center"/>
-          </w:tcPr>
-          <w:p>
-            <w:pPr>
-              <w:jc w:val="center"/>
+              <w:end w:val="single" w:sz="4" w:space="0" w:color="000000"/>
+            </w:tcBorders>
+          </w:tcPr>
+          <w:p>
+            <w:pPr>
+              <w:pStyle w:val="ListParagraph"/>
+              <w:numPr>
+                <w:ilvl w:val="0"/>
+                <w:numId w:val="2"/>
+              </w:numPr>
+              <w:ind w:startChars="0" w:start="400"/>
+              <w:jc w:val="start"/>
+              <w:rPr>
+                <w:rFonts w:ascii="Arial" w:hAnsi="Arial" w:cs="Arial"/>
+                <w:sz w:val="22"/>
+              </w:rPr>
+            </w:pPr>
+            <w:r>
+              <w:rPr>
+                <w:rFonts w:cs="Arial" w:ascii="Arial" w:hAnsi="Arial"/>
+                <w:sz w:val="22"/>
+              </w:rPr>
+              <w:t>Testing Thermal Printer and Sorting out the issues.</w:t>
+            </w:r>
+          </w:p>
+          <w:p>
+            <w:pPr>
+              <w:pStyle w:val="ListParagraph"/>
+              <w:numPr>
+                <w:ilvl w:val="0"/>
+                <w:numId w:val="2"/>
+              </w:numPr>
+              <w:ind w:startChars="0" w:start="400"/>
+              <w:jc w:val="start"/>
+              <w:rPr>
+                <w:rFonts w:ascii="Arial" w:hAnsi="Arial" w:cs="Arial"/>
+                <w:sz w:val="22"/>
+              </w:rPr>
+            </w:pPr>
+            <w:r>
+              <w:rPr>
+                <w:rFonts w:cs="Arial" w:ascii="Arial" w:hAnsi="Arial"/>
+                <w:sz w:val="22"/>
+              </w:rPr>
+              <w:t>Alignment is not the initial problem.</w:t>
+            </w:r>
+          </w:p>
+          <w:p>
+            <w:pPr>
+              <w:pStyle w:val="ListParagraph"/>
+              <w:numPr>
+                <w:ilvl w:val="0"/>
+                <w:numId w:val="2"/>
+              </w:numPr>
+              <w:ind w:startChars="0" w:start="400"/>
+              <w:jc w:val="start"/>
+              <w:rPr>
+                <w:rFonts w:ascii="Arial" w:hAnsi="Arial" w:cs="Arial"/>
+                <w:sz w:val="22"/>
+              </w:rPr>
+            </w:pPr>
+            <w:r>
+              <w:rPr>
+                <w:rFonts w:cs="Arial" w:ascii="Arial" w:hAnsi="Arial"/>
+                <w:sz w:val="22"/>
+              </w:rPr>
+              <w:t xml:space="preserve">Made CMD Interface to test TPH </w:t>
+            </w:r>
+          </w:p>
+          <w:p>
+            <w:pPr>
+              <w:pStyle w:val="ListParagraph"/>
+              <w:numPr>
+                <w:ilvl w:val="0"/>
+                <w:numId w:val="2"/>
+              </w:numPr>
+              <w:ind w:startChars="0" w:start="400"/>
+              <w:jc w:val="start"/>
+              <w:rPr>
+                <w:rFonts w:ascii="Arial" w:hAnsi="Arial" w:cs="Arial"/>
+                <w:sz w:val="22"/>
+              </w:rPr>
+            </w:pPr>
+            <w:r>
+              <w:rPr>
+                <w:rFonts w:cs="Arial" w:ascii="Arial" w:hAnsi="Arial"/>
+                <w:sz w:val="22"/>
+              </w:rPr>
+              <w:t>Planning to change or Inspect the TPH Firmware to find out printing issues.</w:t>
+            </w:r>
+          </w:p>
+        </w:tc>
+        <w:tc>
+          <w:tcPr>
+            <w:tcW w:w="1441" w:type="dxa"/>
+            <w:tcBorders>
+              <w:top w:val="single" w:sz="4" w:space="0" w:color="000000"/>
+              <w:bottom w:val="single" w:sz="4" w:space="0" w:color="000000"/>
+              <w:end w:val="single" w:sz="4" w:space="0" w:color="000000"/>
+            </w:tcBorders>
+          </w:tcPr>
+          <w:p>
+            <w:pPr>
+              <w:pStyle w:val="Normal"/>
+              <w:rPr>
+                <w:rFonts w:ascii="Arial" w:hAnsi="Arial" w:cs="Arial"/>
+                <w:sz w:val="16"/>
+                <w:szCs w:val="16"/>
+              </w:rPr>
+            </w:pPr>
+            <w:r>
+              <w:rPr>
+                <w:rFonts w:cs="Arial" w:ascii="Arial" w:hAnsi="Arial"/>
+                <w:sz w:val="16"/>
+                <w:szCs w:val="16"/>
+              </w:rPr>
+            </w:r>
+          </w:p>
+        </w:tc>
+        <w:tc>
+          <w:tcPr>
+            <w:tcW w:w="862" w:type="dxa"/>
+            <w:tcBorders>
+              <w:top w:val="single" w:sz="4" w:space="0" w:color="000000"/>
+              <w:bottom w:val="single" w:sz="4" w:space="0" w:color="000000"/>
+              <w:end w:val="single" w:sz="4" w:space="0" w:color="000000"/>
+            </w:tcBorders>
+            <w:vAlign w:val="center"/>
+          </w:tcPr>
+          <w:p>
+            <w:pPr>
+              <w:pStyle w:val="Normal"/>
               <w:rPr>
                 <w:rFonts w:ascii="Arial" w:hAnsi="Arial" w:cs="Arial"/>
                 <w:b/>
@@ -1326,63 +1481,37 @@
                 <w:szCs w:val="16"/>
               </w:rPr>
             </w:pPr>
-          </w:p>
-        </w:tc>
-        <w:tc>
-          <w:tcPr>
-            <w:tcW w:w="5380" w:type="dxa"/>
-            <w:tcBorders>
-              <w:top w:val="single" w:sz="4" w:space="0" w:color="000000"/>
-              <w:bottom w:val="single" w:sz="4" w:space="0" w:color="000000"/>
-              <w:right w:val="single" w:sz="4" w:space="0" w:color="000000"/>
-            </w:tcBorders>
-          </w:tcPr>
-          <w:p>
-            <w:pPr>
-              <w:pStyle w:val="BodyText"/>
-              <w:spacing w:after="0"/>
-              <w:jc w:val="left"/>
-              <w:rPr>
-                <w:rFonts w:ascii="Arial" w:hAnsi="Arial" w:cs="Arial"/>
+            <w:r>
+              <w:rPr>
+                <w:rFonts w:cs="Arial" w:ascii="Arial" w:hAnsi="Arial"/>
                 <w:b/>
                 <w:bCs/>
                 <w:sz w:val="16"/>
                 <w:szCs w:val="16"/>
               </w:rPr>
-            </w:pPr>
-          </w:p>
-        </w:tc>
-        <w:tc>
-          <w:tcPr>
-            <w:tcW w:w="1440" w:type="dxa"/>
+            </w:r>
+          </w:p>
+        </w:tc>
+      </w:tr>
+      <w:tr>
+        <w:trPr>
+          <w:trHeight w:val="2609" w:hRule="atLeast"/>
+        </w:trPr>
+        <w:tc>
+          <w:tcPr>
+            <w:tcW w:w="1378" w:type="dxa"/>
             <w:tcBorders>
               <w:top w:val="single" w:sz="4" w:space="0" w:color="000000"/>
+              <w:start w:val="single" w:sz="4" w:space="0" w:color="000000"/>
               <w:bottom w:val="single" w:sz="4" w:space="0" w:color="000000"/>
-              <w:right w:val="single" w:sz="4" w:space="0" w:color="000000"/>
-            </w:tcBorders>
-          </w:tcPr>
-          <w:p>
-            <w:pPr>
-              <w:rPr>
-                <w:rFonts w:ascii="Arial" w:hAnsi="Arial" w:cs="Arial"/>
-                <w:sz w:val="16"/>
-                <w:szCs w:val="16"/>
-              </w:rPr>
-            </w:pPr>
-          </w:p>
-        </w:tc>
-        <w:tc>
-          <w:tcPr>
-            <w:tcW w:w="862" w:type="dxa"/>
-            <w:tcBorders>
-              <w:top w:val="single" w:sz="4" w:space="0" w:color="000000"/>
-              <w:bottom w:val="single" w:sz="4" w:space="0" w:color="000000"/>
-              <w:right w:val="single" w:sz="4" w:space="0" w:color="000000"/>
-            </w:tcBorders>
-            <w:vAlign w:val="center"/>
-          </w:tcPr>
-          <w:p>
-            <w:pPr>
+              <w:end w:val="single" w:sz="4" w:space="0" w:color="000000"/>
+            </w:tcBorders>
+            <w:vAlign w:val="center"/>
+          </w:tcPr>
+          <w:p>
+            <w:pPr>
+              <w:pStyle w:val="Normal"/>
+              <w:jc w:val="center"/>
               <w:rPr>
                 <w:rFonts w:ascii="Arial" w:hAnsi="Arial" w:cs="Arial"/>
                 <w:b/>
@@ -1391,78 +1520,172 @@
                 <w:szCs w:val="16"/>
               </w:rPr>
             </w:pPr>
+            <w:r>
+              <w:rPr>
+                <w:rFonts w:cs="Arial" w:ascii="Arial" w:hAnsi="Arial"/>
+                <w:b/>
+                <w:bCs/>
+                <w:sz w:val="16"/>
+                <w:szCs w:val="16"/>
+              </w:rPr>
+            </w:r>
+          </w:p>
+        </w:tc>
+        <w:tc>
+          <w:tcPr>
+            <w:tcW w:w="5379" w:type="dxa"/>
+            <w:tcBorders>
+              <w:top w:val="single" w:sz="4" w:space="0" w:color="000000"/>
+              <w:bottom w:val="single" w:sz="4" w:space="0" w:color="000000"/>
+              <w:end w:val="single" w:sz="4" w:space="0" w:color="000000"/>
+            </w:tcBorders>
+          </w:tcPr>
+          <w:p>
+            <w:pPr>
+              <w:pStyle w:val="BodyText"/>
+              <w:spacing w:before="0" w:after="0"/>
+              <w:jc w:val="start"/>
+              <w:rPr>
+                <w:rFonts w:ascii="Arial" w:hAnsi="Arial" w:cs="Arial"/>
+                <w:b/>
+                <w:bCs/>
+                <w:sz w:val="16"/>
+                <w:szCs w:val="16"/>
+              </w:rPr>
+            </w:pPr>
+            <w:r>
+              <w:rPr>
+                <w:rFonts w:cs="Arial" w:ascii="Arial" w:hAnsi="Arial"/>
+                <w:b/>
+                <w:bCs/>
+                <w:sz w:val="16"/>
+                <w:szCs w:val="16"/>
+              </w:rPr>
+            </w:r>
+          </w:p>
+        </w:tc>
+        <w:tc>
+          <w:tcPr>
+            <w:tcW w:w="1441" w:type="dxa"/>
+            <w:tcBorders>
+              <w:top w:val="single" w:sz="4" w:space="0" w:color="000000"/>
+              <w:bottom w:val="single" w:sz="4" w:space="0" w:color="000000"/>
+              <w:end w:val="single" w:sz="4" w:space="0" w:color="000000"/>
+            </w:tcBorders>
+          </w:tcPr>
+          <w:p>
+            <w:pPr>
+              <w:pStyle w:val="Normal"/>
+              <w:rPr>
+                <w:rFonts w:ascii="Arial" w:hAnsi="Arial" w:cs="Arial"/>
+                <w:sz w:val="16"/>
+                <w:szCs w:val="16"/>
+              </w:rPr>
+            </w:pPr>
+            <w:r>
+              <w:rPr>
+                <w:rFonts w:cs="Arial" w:ascii="Arial" w:hAnsi="Arial"/>
+                <w:sz w:val="16"/>
+                <w:szCs w:val="16"/>
+              </w:rPr>
+            </w:r>
+          </w:p>
+        </w:tc>
+        <w:tc>
+          <w:tcPr>
+            <w:tcW w:w="862" w:type="dxa"/>
+            <w:tcBorders>
+              <w:top w:val="single" w:sz="4" w:space="0" w:color="000000"/>
+              <w:bottom w:val="single" w:sz="4" w:space="0" w:color="000000"/>
+              <w:end w:val="single" w:sz="4" w:space="0" w:color="000000"/>
+            </w:tcBorders>
+            <w:vAlign w:val="center"/>
+          </w:tcPr>
+          <w:p>
+            <w:pPr>
+              <w:pStyle w:val="Normal"/>
+              <w:rPr>
+                <w:rFonts w:ascii="Arial" w:hAnsi="Arial" w:cs="Arial"/>
+                <w:b/>
+                <w:bCs/>
+                <w:sz w:val="16"/>
+                <w:szCs w:val="16"/>
+              </w:rPr>
+            </w:pPr>
+            <w:r>
+              <w:rPr>
+                <w:rFonts w:cs="Arial" w:ascii="Arial" w:hAnsi="Arial"/>
+                <w:b/>
+                <w:bCs/>
+                <w:sz w:val="16"/>
+                <w:szCs w:val="16"/>
+              </w:rPr>
+            </w:r>
           </w:p>
         </w:tc>
       </w:tr>
     </w:tbl>
     <w:p>
       <w:pPr>
+        <w:pStyle w:val="Normal"/>
         <w:widowControl/>
-        <w:jc w:val="left"/>
+        <w:jc w:val="start"/>
         <w:rPr>
           <w:rFonts w:ascii="Arial" w:hAnsi="Arial" w:cs="Arial"/>
         </w:rPr>
       </w:pPr>
+      <w:r>
+        <w:rPr>
+          <w:rFonts w:cs="Arial" w:ascii="Arial" w:hAnsi="Arial"/>
+        </w:rPr>
+      </w:r>
     </w:p>
     <w:sectPr>
-      <w:headerReference w:type="even" r:id="rId8"/>
-      <w:headerReference w:type="default" r:id="rId9"/>
-      <w:footerReference w:type="even" r:id="rId10"/>
-      <w:footerReference w:type="default" r:id="rId11"/>
-      <w:headerReference w:type="first" r:id="rId12"/>
-      <w:footerReference w:type="first" r:id="rId13"/>
+      <w:headerReference w:type="even" r:id="rId2"/>
+      <w:headerReference w:type="default" r:id="rId3"/>
+      <w:headerReference w:type="first" r:id="rId4"/>
+      <w:footerReference w:type="even" r:id="rId5"/>
+      <w:footerReference w:type="default" r:id="rId6"/>
+      <w:footerReference w:type="first" r:id="rId7"/>
+      <w:type w:val="nextPage"/>
       <w:pgSz w:w="11906" w:h="16838"/>
-      <w:pgMar w:top="1701" w:right="1440" w:bottom="1440" w:left="1440" w:header="851" w:footer="992" w:gutter="0"/>
-      <w:cols w:space="720"/>
-      <w:formProt w:val="0"/>
-      <w:docGrid w:linePitch="360"/>
+      <w:pgMar w:left="1440" w:right="1440" w:gutter="0" w:header="851" w:top="1701" w:footer="992" w:bottom="1440"/>
+      <w:pgNumType w:fmt="decimal"/>
+      <w:formProt w:val="false"/>
+      <w:textDirection w:val="lrTb"/>
+      <w:docGrid w:type="default" w:linePitch="360" w:charSpace="0"/>
     </w:sectPr>
   </w:body>
 </w:document>
 </file>
 
-<file path=word/endnotes.xml><?xml version="1.0" encoding="utf-8"?>
-<w:endnotes xmlns:wpc="http://schemas.microsoft.com/office/word/2010/wordprocessingCanvas" xmlns:cx="http://schemas.microsoft.com/office/drawing/2014/chartex" xmlns:cx1="http://schemas.microsoft.com/office/drawing/2015/9/8/chartex" xmlns:cx2="http://schemas.microsoft.com/office/drawing/2015/10/21/chartex" xmlns:cx3="http://schemas.microsoft.com/office/drawing/2016/5/9/chartex" xmlns:cx4="http://schemas.microsoft.com/office/drawing/2016/5/10/chartex" xmlns:cx5="http://schemas.microsoft.com/office/drawing/2016/5/11/chartex" xmlns:cx6="http://schemas.microsoft.com/office/drawing/2016/5/12/chartex" xmlns:cx7="http://schemas.microsoft.com/office/drawing/2016/5/13/chartex" xmlns:cx8="http://schemas.microsoft.com/office/drawing/2016/5/14/chartex" xmlns:mc="http://schemas.openxmlformats.org/markup-compatibility/2006" xmlns:aink="http://schemas.microsoft.com/office/drawing/2016/ink" xmlns:am3d="http://schemas.microsoft.com/office/drawing/2017/model3d" xmlns:o="urn:schemas-microsoft-com:office:office" xmlns:oel="http://schemas.microsoft.com/office/2019/extlst" xmlns:r="http://schemas.openxmlformats.org/officeDocument/2006/relationships" xmlns:m="http://schemas.openxmlformats.org/officeDocument/2006/math" xmlns:v="urn:schemas-microsoft-com:vml" xmlns:wp14="http://schemas.microsoft.com/office/word/2010/wordprocessingDrawing" xmlns:wp="http://schemas.openxmlformats.org/drawingml/2006/wordprocessingDrawing" xmlns:w10="urn:schemas-microsoft-com:office:word" xmlns:w="http://schemas.openxmlformats.org/wordprocessingml/2006/main" xmlns:w14="http://schemas.microsoft.com/office/word/2010/wordml" xmlns:w15="http://schemas.microsoft.com/office/word/2012/wordml" xmlns:w16cex="http://schemas.microsoft.com/office/word/2018/wordml/cex" xmlns:w16cid="http://schemas.microsoft.com/office/word/2016/wordml/cid" xmlns:w16="http://schemas.microsoft.com/office/word/2018/wordml" xmlns:w16du="http://schemas.microsoft.com/office/word/2023/wordml/word16du" xmlns:w16sdtdh="http://schemas.microsoft.com/office/word/2020/wordml/sdtdatahash" xmlns:w16sdtfl="http://schemas.microsoft.com/office/word/2024/wordml/sdtformatlock" xmlns:w16se="http://schemas.microsoft.com/office/word/2015/wordml/symex" xmlns:wpg="http://schemas.microsoft.com/office/word/2010/wordprocessingGroup" xmlns:wpi="http://schemas.microsoft.com/office/word/2010/wordprocessingInk" xmlns:wne="http://schemas.microsoft.com/office/word/2006/wordml" xmlns:wps="http://schemas.microsoft.com/office/word/2010/wordprocessingShape" mc:Ignorable="w14 w15 w16se w16cid w16 w16cex w16sdtdh w16sdtfl w16du wp14">
-  <w:endnote w:type="separator" w:id="-1">
-    <w:p>
-      <w:r>
-        <w:separator/>
-      </w:r>
-    </w:p>
-  </w:endnote>
-  <w:endnote w:type="continuationSeparator" w:id="0">
-    <w:p>
-      <w:r>
-        <w:continuationSeparator/>
-      </w:r>
-    </w:p>
-  </w:endnote>
-</w:endnotes>
-</file>
-
 <file path=word/footer1.xml><?xml version="1.0" encoding="utf-8"?>
-<w:ftr xmlns:wpc="http://schemas.microsoft.com/office/word/2010/wordprocessingCanvas" xmlns:cx="http://schemas.microsoft.com/office/drawing/2014/chartex" xmlns:cx1="http://schemas.microsoft.com/office/drawing/2015/9/8/chartex" xmlns:cx2="http://schemas.microsoft.com/office/drawing/2015/10/21/chartex" xmlns:cx3="http://schemas.microsoft.com/office/drawing/2016/5/9/chartex" xmlns:cx4="http://schemas.microsoft.com/office/drawing/2016/5/10/chartex" xmlns:cx5="http://schemas.microsoft.com/office/drawing/2016/5/11/chartex" xmlns:cx6="http://schemas.microsoft.com/office/drawing/2016/5/12/chartex" xmlns:cx7="http://schemas.microsoft.com/office/drawing/2016/5/13/chartex" xmlns:cx8="http://schemas.microsoft.com/office/drawing/2016/5/14/chartex" xmlns:mc="http://schemas.openxmlformats.org/markup-compatibility/2006" xmlns:aink="http://schemas.microsoft.com/office/drawing/2016/ink" xmlns:am3d="http://schemas.microsoft.com/office/drawing/2017/model3d" xmlns:o="urn:schemas-microsoft-com:office:office" xmlns:oel="http://schemas.microsoft.com/office/2019/extlst" xmlns:r="http://schemas.openxmlformats.org/officeDocument/2006/relationships" xmlns:m="http://schemas.openxmlformats.org/officeDocument/2006/math" xmlns:v="urn:schemas-microsoft-com:vml" xmlns:wp14="http://schemas.microsoft.com/office/word/2010/wordprocessingDrawing" xmlns:wp="http://schemas.openxmlformats.org/drawingml/2006/wordprocessingDrawing" xmlns:w10="urn:schemas-microsoft-com:office:word" xmlns:w="http://schemas.openxmlformats.org/wordprocessingml/2006/main" xmlns:w14="http://schemas.microsoft.com/office/word/2010/wordml" xmlns:w15="http://schemas.microsoft.com/office/word/2012/wordml" xmlns:w16cex="http://schemas.microsoft.com/office/word/2018/wordml/cex" xmlns:w16cid="http://schemas.microsoft.com/office/word/2016/wordml/cid" xmlns:w16="http://schemas.microsoft.com/office/word/2018/wordml" xmlns:w16du="http://schemas.microsoft.com/office/word/2023/wordml/word16du" xmlns:w16sdtdh="http://schemas.microsoft.com/office/word/2020/wordml/sdtdatahash" xmlns:w16sdtfl="http://schemas.microsoft.com/office/word/2024/wordml/sdtformatlock" xmlns:w16se="http://schemas.microsoft.com/office/word/2015/wordml/symex" xmlns:wpg="http://schemas.microsoft.com/office/word/2010/wordprocessingGroup" xmlns:wpi="http://schemas.microsoft.com/office/word/2010/wordprocessingInk" xmlns:wne="http://schemas.microsoft.com/office/word/2006/wordml" xmlns:wps="http://schemas.microsoft.com/office/word/2010/wordprocessingShape" mc:Ignorable="w14 w15 w16se w16cid w16 w16cex w16sdtdh w16sdtfl w16du wp14">
+<w:ftr xmlns:o="urn:schemas-microsoft-com:office:office" xmlns:r="http://schemas.openxmlformats.org/officeDocument/2006/relationships" xmlns:v="urn:schemas-microsoft-com:vml" xmlns:w="http://schemas.openxmlformats.org/wordprocessingml/2006/main" xmlns:w10="urn:schemas-microsoft-com:office:word" xmlns:wp="http://schemas.openxmlformats.org/drawingml/2006/wordprocessingDrawing" xmlns:pic="http://schemas.openxmlformats.org/drawingml/2006/picture" xmlns:wps="http://schemas.microsoft.com/office/word/2010/wordprocessingShape" xmlns:wpg="http://schemas.microsoft.com/office/word/2010/wordprocessingGroup" xmlns:mc="http://schemas.openxmlformats.org/markup-compatibility/2006" xmlns:wp14="http://schemas.microsoft.com/office/word/2010/wordprocessingDrawing" xmlns:w14="http://schemas.microsoft.com/office/word/2010/wordml" xmlns:w15="http://schemas.microsoft.com/office/word/2012/wordml" mc:Ignorable="w14 wp14 w15">
   <w:p>
     <w:pPr>
       <w:pStyle w:val="Footer"/>
+      <w:rPr/>
     </w:pPr>
+    <w:r>
+      <w:rPr/>
+    </w:r>
   </w:p>
 </w:ftr>
 </file>
 
 <file path=word/footer2.xml><?xml version="1.0" encoding="utf-8"?>
-<w:ftr xmlns:wpc="http://schemas.microsoft.com/office/word/2010/wordprocessingCanvas" xmlns:cx="http://schemas.microsoft.com/office/drawing/2014/chartex" xmlns:cx1="http://schemas.microsoft.com/office/drawing/2015/9/8/chartex" xmlns:cx2="http://schemas.microsoft.com/office/drawing/2015/10/21/chartex" xmlns:cx3="http://schemas.microsoft.com/office/drawing/2016/5/9/chartex" xmlns:cx4="http://schemas.microsoft.com/office/drawing/2016/5/10/chartex" xmlns:cx5="http://schemas.microsoft.com/office/drawing/2016/5/11/chartex" xmlns:cx6="http://schemas.microsoft.com/office/drawing/2016/5/12/chartex" xmlns:cx7="http://schemas.microsoft.com/office/drawing/2016/5/13/chartex" xmlns:cx8="http://schemas.microsoft.com/office/drawing/2016/5/14/chartex" xmlns:mc="http://schemas.openxmlformats.org/markup-compatibility/2006" xmlns:aink="http://schemas.microsoft.com/office/drawing/2016/ink" xmlns:am3d="http://schemas.microsoft.com/office/drawing/2017/model3d" xmlns:o="urn:schemas-microsoft-com:office:office" xmlns:oel="http://schemas.microsoft.com/office/2019/extlst" xmlns:r="http://schemas.openxmlformats.org/officeDocument/2006/relationships" xmlns:m="http://schemas.openxmlformats.org/officeDocument/2006/math" xmlns:v="urn:schemas-microsoft-com:vml" xmlns:wp14="http://schemas.microsoft.com/office/word/2010/wordprocessingDrawing" xmlns:wp="http://schemas.openxmlformats.org/drawingml/2006/wordprocessingDrawing" xmlns:w10="urn:schemas-microsoft-com:office:word" xmlns:w="http://schemas.openxmlformats.org/wordprocessingml/2006/main" xmlns:w14="http://schemas.microsoft.com/office/word/2010/wordml" xmlns:w15="http://schemas.microsoft.com/office/word/2012/wordml" xmlns:w16cex="http://schemas.microsoft.com/office/word/2018/wordml/cex" xmlns:w16cid="http://schemas.microsoft.com/office/word/2016/wordml/cid" xmlns:w16="http://schemas.microsoft.com/office/word/2018/wordml" xmlns:w16du="http://schemas.microsoft.com/office/word/2023/wordml/word16du" xmlns:w16sdtdh="http://schemas.microsoft.com/office/word/2020/wordml/sdtdatahash" xmlns:w16sdtfl="http://schemas.microsoft.com/office/word/2024/wordml/sdtformatlock" xmlns:w16se="http://schemas.microsoft.com/office/word/2015/wordml/symex" xmlns:wpg="http://schemas.microsoft.com/office/word/2010/wordprocessingGroup" xmlns:wpi="http://schemas.microsoft.com/office/word/2010/wordprocessingInk" xmlns:wne="http://schemas.microsoft.com/office/word/2006/wordml" xmlns:wps="http://schemas.microsoft.com/office/word/2010/wordprocessingShape" mc:Ignorable="w14 w15 w16se w16cid w16 w16cex w16sdtdh w16sdtfl w16du wp14">
+<w:ftr xmlns:o="urn:schemas-microsoft-com:office:office" xmlns:r="http://schemas.openxmlformats.org/officeDocument/2006/relationships" xmlns:v="urn:schemas-microsoft-com:vml" xmlns:w="http://schemas.openxmlformats.org/wordprocessingml/2006/main" xmlns:w10="urn:schemas-microsoft-com:office:word" xmlns:wp="http://schemas.openxmlformats.org/drawingml/2006/wordprocessingDrawing" xmlns:pic="http://schemas.openxmlformats.org/drawingml/2006/picture" xmlns:wps="http://schemas.microsoft.com/office/word/2010/wordprocessingShape" xmlns:wpg="http://schemas.microsoft.com/office/word/2010/wordprocessingGroup" xmlns:mc="http://schemas.openxmlformats.org/markup-compatibility/2006" xmlns:wp14="http://schemas.microsoft.com/office/word/2010/wordprocessingDrawing" xmlns:w14="http://schemas.microsoft.com/office/word/2010/wordml" xmlns:w15="http://schemas.microsoft.com/office/word/2012/wordml" mc:Ignorable="w14 wp14 w15">
   <w:p>
     <w:pPr>
-      <w:pStyle w:val="a"/>
-      <w:jc w:val="left"/>
+      <w:pStyle w:val="Style13"/>
+      <w:jc w:val="start"/>
       <w:rPr>
         <w:rFonts w:hint="eastAsia"/>
       </w:rPr>
     </w:pPr>
     <w:r>
       <w:rPr>
-        <w:rFonts w:eastAsia="Arial Unicode MS" w:cs="Arial Unicode MS" w:hint="eastAsia"/>
+        <w:rFonts w:cs="Arial Unicode MS" w:hint="eastAsia" w:eastAsia="Arial Unicode MS"/>
         <w:sz w:val="16"/>
         <w:szCs w:val="16"/>
       </w:rPr>
@@ -1478,7 +1701,7 @@
     </w:r>
     <w:r>
       <w:rPr>
-        <w:rFonts w:eastAsia="Arial Unicode MS" w:cs="Arial Unicode MS" w:hint="eastAsia"/>
+        <w:rFonts w:cs="Arial Unicode MS" w:hint="eastAsia" w:eastAsia="Arial Unicode MS"/>
         <w:sz w:val="16"/>
         <w:szCs w:val="16"/>
       </w:rPr>
@@ -1527,7 +1750,7 @@
     </w:r>
     <w:r>
       <w:rPr>
-        <w:rFonts w:eastAsia="Arial Unicode MS" w:cs="Arial Unicode MS" w:hint="eastAsia"/>
+        <w:rFonts w:cs="Arial Unicode MS" w:hint="eastAsia" w:eastAsia="Arial Unicode MS"/>
         <w:sz w:val="16"/>
         <w:szCs w:val="16"/>
       </w:rPr>
@@ -1538,18 +1761,18 @@
 </file>
 
 <file path=word/footer3.xml><?xml version="1.0" encoding="utf-8"?>
-<w:ftr xmlns:wpc="http://schemas.microsoft.com/office/word/2010/wordprocessingCanvas" xmlns:cx="http://schemas.microsoft.com/office/drawing/2014/chartex" xmlns:cx1="http://schemas.microsoft.com/office/drawing/2015/9/8/chartex" xmlns:cx2="http://schemas.microsoft.com/office/drawing/2015/10/21/chartex" xmlns:cx3="http://schemas.microsoft.com/office/drawing/2016/5/9/chartex" xmlns:cx4="http://schemas.microsoft.com/office/drawing/2016/5/10/chartex" xmlns:cx5="http://schemas.microsoft.com/office/drawing/2016/5/11/chartex" xmlns:cx6="http://schemas.microsoft.com/office/drawing/2016/5/12/chartex" xmlns:cx7="http://schemas.microsoft.com/office/drawing/2016/5/13/chartex" xmlns:cx8="http://schemas.microsoft.com/office/drawing/2016/5/14/chartex" xmlns:mc="http://schemas.openxmlformats.org/markup-compatibility/2006" xmlns:aink="http://schemas.microsoft.com/office/drawing/2016/ink" xmlns:am3d="http://schemas.microsoft.com/office/drawing/2017/model3d" xmlns:o="urn:schemas-microsoft-com:office:office" xmlns:oel="http://schemas.microsoft.com/office/2019/extlst" xmlns:r="http://schemas.openxmlformats.org/officeDocument/2006/relationships" xmlns:m="http://schemas.openxmlformats.org/officeDocument/2006/math" xmlns:v="urn:schemas-microsoft-com:vml" xmlns:wp14="http://schemas.microsoft.com/office/word/2010/wordprocessingDrawing" xmlns:wp="http://schemas.openxmlformats.org/drawingml/2006/wordprocessingDrawing" xmlns:w10="urn:schemas-microsoft-com:office:word" xmlns:w="http://schemas.openxmlformats.org/wordprocessingml/2006/main" xmlns:w14="http://schemas.microsoft.com/office/word/2010/wordml" xmlns:w15="http://schemas.microsoft.com/office/word/2012/wordml" xmlns:w16cex="http://schemas.microsoft.com/office/word/2018/wordml/cex" xmlns:w16cid="http://schemas.microsoft.com/office/word/2016/wordml/cid" xmlns:w16="http://schemas.microsoft.com/office/word/2018/wordml" xmlns:w16du="http://schemas.microsoft.com/office/word/2023/wordml/word16du" xmlns:w16sdtdh="http://schemas.microsoft.com/office/word/2020/wordml/sdtdatahash" xmlns:w16sdtfl="http://schemas.microsoft.com/office/word/2024/wordml/sdtformatlock" xmlns:w16se="http://schemas.microsoft.com/office/word/2015/wordml/symex" xmlns:wpg="http://schemas.microsoft.com/office/word/2010/wordprocessingGroup" xmlns:wpi="http://schemas.microsoft.com/office/word/2010/wordprocessingInk" xmlns:wne="http://schemas.microsoft.com/office/word/2006/wordml" xmlns:wps="http://schemas.microsoft.com/office/word/2010/wordprocessingShape" mc:Ignorable="w14 w15 w16se w16cid w16 w16cex w16sdtdh w16sdtfl w16du wp14">
+<w:ftr xmlns:o="urn:schemas-microsoft-com:office:office" xmlns:r="http://schemas.openxmlformats.org/officeDocument/2006/relationships" xmlns:v="urn:schemas-microsoft-com:vml" xmlns:w="http://schemas.openxmlformats.org/wordprocessingml/2006/main" xmlns:w10="urn:schemas-microsoft-com:office:word" xmlns:wp="http://schemas.openxmlformats.org/drawingml/2006/wordprocessingDrawing" xmlns:pic="http://schemas.openxmlformats.org/drawingml/2006/picture" xmlns:wps="http://schemas.microsoft.com/office/word/2010/wordprocessingShape" xmlns:wpg="http://schemas.microsoft.com/office/word/2010/wordprocessingGroup" xmlns:mc="http://schemas.openxmlformats.org/markup-compatibility/2006" xmlns:wp14="http://schemas.microsoft.com/office/word/2010/wordprocessingDrawing" xmlns:w14="http://schemas.microsoft.com/office/word/2010/wordml" xmlns:w15="http://schemas.microsoft.com/office/word/2012/wordml" mc:Ignorable="w14 wp14 w15">
   <w:p>
     <w:pPr>
-      <w:pStyle w:val="a"/>
-      <w:jc w:val="left"/>
+      <w:pStyle w:val="Style13"/>
+      <w:jc w:val="start"/>
       <w:rPr>
         <w:rFonts w:hint="eastAsia"/>
       </w:rPr>
     </w:pPr>
     <w:r>
       <w:rPr>
-        <w:rFonts w:eastAsia="Arial Unicode MS" w:cs="Arial Unicode MS" w:hint="eastAsia"/>
+        <w:rFonts w:cs="Arial Unicode MS" w:hint="eastAsia" w:eastAsia="Arial Unicode MS"/>
         <w:sz w:val="16"/>
         <w:szCs w:val="16"/>
       </w:rPr>
@@ -1565,7 +1788,7 @@
     </w:r>
     <w:r>
       <w:rPr>
-        <w:rFonts w:eastAsia="Arial Unicode MS" w:cs="Arial Unicode MS" w:hint="eastAsia"/>
+        <w:rFonts w:cs="Arial Unicode MS" w:hint="eastAsia" w:eastAsia="Arial Unicode MS"/>
         <w:sz w:val="16"/>
         <w:szCs w:val="16"/>
       </w:rPr>
@@ -1614,7 +1837,7 @@
     </w:r>
     <w:r>
       <w:rPr>
-        <w:rFonts w:eastAsia="Arial Unicode MS" w:cs="Arial Unicode MS" w:hint="eastAsia"/>
+        <w:rFonts w:cs="Arial Unicode MS" w:hint="eastAsia" w:eastAsia="Arial Unicode MS"/>
         <w:sz w:val="16"/>
         <w:szCs w:val="16"/>
       </w:rPr>
@@ -1624,51 +1847,34 @@
 </w:ftr>
 </file>
 
-<file path=word/footnotes.xml><?xml version="1.0" encoding="utf-8"?>
-<w:footnotes xmlns:wpc="http://schemas.microsoft.com/office/word/2010/wordprocessingCanvas" xmlns:cx="http://schemas.microsoft.com/office/drawing/2014/chartex" xmlns:cx1="http://schemas.microsoft.com/office/drawing/2015/9/8/chartex" xmlns:cx2="http://schemas.microsoft.com/office/drawing/2015/10/21/chartex" xmlns:cx3="http://schemas.microsoft.com/office/drawing/2016/5/9/chartex" xmlns:cx4="http://schemas.microsoft.com/office/drawing/2016/5/10/chartex" xmlns:cx5="http://schemas.microsoft.com/office/drawing/2016/5/11/chartex" xmlns:cx6="http://schemas.microsoft.com/office/drawing/2016/5/12/chartex" xmlns:cx7="http://schemas.microsoft.com/office/drawing/2016/5/13/chartex" xmlns:cx8="http://schemas.microsoft.com/office/drawing/2016/5/14/chartex" xmlns:mc="http://schemas.openxmlformats.org/markup-compatibility/2006" xmlns:aink="http://schemas.microsoft.com/office/drawing/2016/ink" xmlns:am3d="http://schemas.microsoft.com/office/drawing/2017/model3d" xmlns:o="urn:schemas-microsoft-com:office:office" xmlns:oel="http://schemas.microsoft.com/office/2019/extlst" xmlns:r="http://schemas.openxmlformats.org/officeDocument/2006/relationships" xmlns:m="http://schemas.openxmlformats.org/officeDocument/2006/math" xmlns:v="urn:schemas-microsoft-com:vml" xmlns:wp14="http://schemas.microsoft.com/office/word/2010/wordprocessingDrawing" xmlns:wp="http://schemas.openxmlformats.org/drawingml/2006/wordprocessingDrawing" xmlns:w10="urn:schemas-microsoft-com:office:word" xmlns:w="http://schemas.openxmlformats.org/wordprocessingml/2006/main" xmlns:w14="http://schemas.microsoft.com/office/word/2010/wordml" xmlns:w15="http://schemas.microsoft.com/office/word/2012/wordml" xmlns:w16cex="http://schemas.microsoft.com/office/word/2018/wordml/cex" xmlns:w16cid="http://schemas.microsoft.com/office/word/2016/wordml/cid" xmlns:w16="http://schemas.microsoft.com/office/word/2018/wordml" xmlns:w16du="http://schemas.microsoft.com/office/word/2023/wordml/word16du" xmlns:w16sdtdh="http://schemas.microsoft.com/office/word/2020/wordml/sdtdatahash" xmlns:w16sdtfl="http://schemas.microsoft.com/office/word/2024/wordml/sdtformatlock" xmlns:w16se="http://schemas.microsoft.com/office/word/2015/wordml/symex" xmlns:wpg="http://schemas.microsoft.com/office/word/2010/wordprocessingGroup" xmlns:wpi="http://schemas.microsoft.com/office/word/2010/wordprocessingInk" xmlns:wne="http://schemas.microsoft.com/office/word/2006/wordml" xmlns:wps="http://schemas.microsoft.com/office/word/2010/wordprocessingShape" mc:Ignorable="w14 w15 w16se w16cid w16 w16cex w16sdtdh w16sdtfl w16du wp14">
-  <w:footnote w:type="separator" w:id="-1">
-    <w:p>
-      <w:r>
-        <w:separator/>
-      </w:r>
-    </w:p>
-  </w:footnote>
-  <w:footnote w:type="continuationSeparator" w:id="0">
-    <w:p>
-      <w:r>
-        <w:continuationSeparator/>
-      </w:r>
-    </w:p>
-  </w:footnote>
-</w:footnotes>
-</file>
-
 <file path=word/header1.xml><?xml version="1.0" encoding="utf-8"?>
-<w:hdr xmlns:wpc="http://schemas.microsoft.com/office/word/2010/wordprocessingCanvas" xmlns:cx="http://schemas.microsoft.com/office/drawing/2014/chartex" xmlns:cx1="http://schemas.microsoft.com/office/drawing/2015/9/8/chartex" xmlns:cx2="http://schemas.microsoft.com/office/drawing/2015/10/21/chartex" xmlns:cx3="http://schemas.microsoft.com/office/drawing/2016/5/9/chartex" xmlns:cx4="http://schemas.microsoft.com/office/drawing/2016/5/10/chartex" xmlns:cx5="http://schemas.microsoft.com/office/drawing/2016/5/11/chartex" xmlns:cx6="http://schemas.microsoft.com/office/drawing/2016/5/12/chartex" xmlns:cx7="http://schemas.microsoft.com/office/drawing/2016/5/13/chartex" xmlns:cx8="http://schemas.microsoft.com/office/drawing/2016/5/14/chartex" xmlns:mc="http://schemas.openxmlformats.org/markup-compatibility/2006" xmlns:aink="http://schemas.microsoft.com/office/drawing/2016/ink" xmlns:am3d="http://schemas.microsoft.com/office/drawing/2017/model3d" xmlns:o="urn:schemas-microsoft-com:office:office" xmlns:oel="http://schemas.microsoft.com/office/2019/extlst" xmlns:r="http://schemas.openxmlformats.org/officeDocument/2006/relationships" xmlns:m="http://schemas.openxmlformats.org/officeDocument/2006/math" xmlns:v="urn:schemas-microsoft-com:vml" xmlns:wp14="http://schemas.microsoft.com/office/word/2010/wordprocessingDrawing" xmlns:wp="http://schemas.openxmlformats.org/drawingml/2006/wordprocessingDrawing" xmlns:w10="urn:schemas-microsoft-com:office:word" xmlns:w="http://schemas.openxmlformats.org/wordprocessingml/2006/main" xmlns:w14="http://schemas.microsoft.com/office/word/2010/wordml" xmlns:w15="http://schemas.microsoft.com/office/word/2012/wordml" xmlns:w16cex="http://schemas.microsoft.com/office/word/2018/wordml/cex" xmlns:w16cid="http://schemas.microsoft.com/office/word/2016/wordml/cid" xmlns:w16="http://schemas.microsoft.com/office/word/2018/wordml" xmlns:w16du="http://schemas.microsoft.com/office/word/2023/wordml/word16du" xmlns:w16sdtdh="http://schemas.microsoft.com/office/word/2020/wordml/sdtdatahash" xmlns:w16sdtfl="http://schemas.microsoft.com/office/word/2024/wordml/sdtformatlock" xmlns:w16se="http://schemas.microsoft.com/office/word/2015/wordml/symex" xmlns:wpg="http://schemas.microsoft.com/office/word/2010/wordprocessingGroup" xmlns:wpi="http://schemas.microsoft.com/office/word/2010/wordprocessingInk" xmlns:wne="http://schemas.microsoft.com/office/word/2006/wordml" xmlns:wps="http://schemas.microsoft.com/office/word/2010/wordprocessingShape" mc:Ignorable="w14 w15 w16se w16cid w16 w16cex w16sdtdh w16sdtfl w16du wp14">
+<w:hdr xmlns:o="urn:schemas-microsoft-com:office:office" xmlns:r="http://schemas.openxmlformats.org/officeDocument/2006/relationships" xmlns:v="urn:schemas-microsoft-com:vml" xmlns:w="http://schemas.openxmlformats.org/wordprocessingml/2006/main" xmlns:w10="urn:schemas-microsoft-com:office:word" xmlns:wp="http://schemas.openxmlformats.org/drawingml/2006/wordprocessingDrawing" xmlns:pic="http://schemas.openxmlformats.org/drawingml/2006/picture" xmlns:wps="http://schemas.microsoft.com/office/word/2010/wordprocessingShape" xmlns:wpg="http://schemas.microsoft.com/office/word/2010/wordprocessingGroup" xmlns:mc="http://schemas.openxmlformats.org/markup-compatibility/2006" xmlns:wp14="http://schemas.microsoft.com/office/word/2010/wordprocessingDrawing" xmlns:w14="http://schemas.microsoft.com/office/word/2010/wordml" xmlns:w15="http://schemas.microsoft.com/office/word/2012/wordml" mc:Ignorable="w14 wp14 w15">
   <w:p>
     <w:pPr>
       <w:pStyle w:val="Header"/>
+      <w:rPr/>
     </w:pPr>
+    <w:r>
+      <w:rPr/>
+    </w:r>
   </w:p>
 </w:hdr>
 </file>
 
 <file path=word/header2.xml><?xml version="1.0" encoding="utf-8"?>
-<w:hdr xmlns:wpc="http://schemas.microsoft.com/office/word/2010/wordprocessingCanvas" xmlns:cx="http://schemas.microsoft.com/office/drawing/2014/chartex" xmlns:cx1="http://schemas.microsoft.com/office/drawing/2015/9/8/chartex" xmlns:cx2="http://schemas.microsoft.com/office/drawing/2015/10/21/chartex" xmlns:cx3="http://schemas.microsoft.com/office/drawing/2016/5/9/chartex" xmlns:cx4="http://schemas.microsoft.com/office/drawing/2016/5/10/chartex" xmlns:cx5="http://schemas.microsoft.com/office/drawing/2016/5/11/chartex" xmlns:cx6="http://schemas.microsoft.com/office/drawing/2016/5/12/chartex" xmlns:cx7="http://schemas.microsoft.com/office/drawing/2016/5/13/chartex" xmlns:cx8="http://schemas.microsoft.com/office/drawing/2016/5/14/chartex" xmlns:mc="http://schemas.openxmlformats.org/markup-compatibility/2006" xmlns:aink="http://schemas.microsoft.com/office/drawing/2016/ink" xmlns:am3d="http://schemas.microsoft.com/office/drawing/2017/model3d" xmlns:o="urn:schemas-microsoft-com:office:office" xmlns:oel="http://schemas.microsoft.com/office/2019/extlst" xmlns:r="http://schemas.openxmlformats.org/officeDocument/2006/relationships" xmlns:m="http://schemas.openxmlformats.org/officeDocument/2006/math" xmlns:v="urn:schemas-microsoft-com:vml" xmlns:wp14="http://schemas.microsoft.com/office/word/2010/wordprocessingDrawing" xmlns:wp="http://schemas.openxmlformats.org/drawingml/2006/wordprocessingDrawing" xmlns:w10="urn:schemas-microsoft-com:office:word" xmlns:w="http://schemas.openxmlformats.org/wordprocessingml/2006/main" xmlns:w14="http://schemas.microsoft.com/office/word/2010/wordml" xmlns:w15="http://schemas.microsoft.com/office/word/2012/wordml" xmlns:w16cex="http://schemas.microsoft.com/office/word/2018/wordml/cex" xmlns:w16cid="http://schemas.microsoft.com/office/word/2016/wordml/cid" xmlns:w16="http://schemas.microsoft.com/office/word/2018/wordml" xmlns:w16du="http://schemas.microsoft.com/office/word/2023/wordml/word16du" xmlns:w16sdtdh="http://schemas.microsoft.com/office/word/2020/wordml/sdtdatahash" xmlns:w16sdtfl="http://schemas.microsoft.com/office/word/2024/wordml/sdtformatlock" xmlns:w16se="http://schemas.microsoft.com/office/word/2015/wordml/symex" xmlns:wpg="http://schemas.microsoft.com/office/word/2010/wordprocessingGroup" xmlns:wpi="http://schemas.microsoft.com/office/word/2010/wordprocessingInk" xmlns:wne="http://schemas.microsoft.com/office/word/2006/wordml" xmlns:wps="http://schemas.microsoft.com/office/word/2010/wordprocessingShape" mc:Ignorable="w14 w15 w16se w16cid w16 w16cex w16sdtdh w16sdtfl w16du wp14">
+<w:hdr xmlns:o="urn:schemas-microsoft-com:office:office" xmlns:r="http://schemas.openxmlformats.org/officeDocument/2006/relationships" xmlns:v="urn:schemas-microsoft-com:vml" xmlns:w="http://schemas.openxmlformats.org/wordprocessingml/2006/main" xmlns:w10="urn:schemas-microsoft-com:office:word" xmlns:wp="http://schemas.openxmlformats.org/drawingml/2006/wordprocessingDrawing" xmlns:pic="http://schemas.openxmlformats.org/drawingml/2006/picture" xmlns:wps="http://schemas.microsoft.com/office/word/2010/wordprocessingShape" xmlns:wpg="http://schemas.microsoft.com/office/word/2010/wordprocessingGroup" xmlns:mc="http://schemas.openxmlformats.org/markup-compatibility/2006" xmlns:wp14="http://schemas.microsoft.com/office/word/2010/wordprocessingDrawing" xmlns:w14="http://schemas.microsoft.com/office/word/2010/wordml" xmlns:w15="http://schemas.microsoft.com/office/word/2012/wordml" mc:Ignorable="w14 wp14 w15">
   <w:p>
     <w:pPr>
-      <w:pStyle w:val="a"/>
-      <w:snapToGrid/>
+      <w:pStyle w:val="Style13"/>
+      <w:snapToGrid w:val="true"/>
       <w:rPr>
         <w:rFonts w:hint="eastAsia"/>
       </w:rPr>
     </w:pPr>
     <w:r>
-      <w:rPr>
-        <w:noProof/>
-      </w:rPr>
+      <w:rPr/>
       <w:drawing>
-        <wp:inline distT="0" distB="0" distL="0" distR="0" wp14:anchorId="28A1F156" wp14:editId="67B44AD4">
+        <wp:inline distT="0" distB="0" distL="0" distR="0">
           <wp:extent cx="857250" cy="266700"/>
           <wp:effectExtent l="0" t="0" r="0" b="0"/>
           <wp:docPr id="1" name="그림 1"/>
@@ -1710,27 +1916,29 @@
   <w:p>
     <w:pPr>
       <w:pStyle w:val="Header"/>
+      <w:rPr/>
     </w:pPr>
+    <w:r>
+      <w:rPr/>
+    </w:r>
   </w:p>
 </w:hdr>
 </file>
 
 <file path=word/header3.xml><?xml version="1.0" encoding="utf-8"?>
-<w:hdr xmlns:wpc="http://schemas.microsoft.com/office/word/2010/wordprocessingCanvas" xmlns:cx="http://schemas.microsoft.com/office/drawing/2014/chartex" xmlns:cx1="http://schemas.microsoft.com/office/drawing/2015/9/8/chartex" xmlns:cx2="http://schemas.microsoft.com/office/drawing/2015/10/21/chartex" xmlns:cx3="http://schemas.microsoft.com/office/drawing/2016/5/9/chartex" xmlns:cx4="http://schemas.microsoft.com/office/drawing/2016/5/10/chartex" xmlns:cx5="http://schemas.microsoft.com/office/drawing/2016/5/11/chartex" xmlns:cx6="http://schemas.microsoft.com/office/drawing/2016/5/12/chartex" xmlns:cx7="http://schemas.microsoft.com/office/drawing/2016/5/13/chartex" xmlns:cx8="http://schemas.microsoft.com/office/drawing/2016/5/14/chartex" xmlns:mc="http://schemas.openxmlformats.org/markup-compatibility/2006" xmlns:aink="http://schemas.microsoft.com/office/drawing/2016/ink" xmlns:am3d="http://schemas.microsoft.com/office/drawing/2017/model3d" xmlns:o="urn:schemas-microsoft-com:office:office" xmlns:oel="http://schemas.microsoft.com/office/2019/extlst" xmlns:r="http://schemas.openxmlformats.org/officeDocument/2006/relationships" xmlns:m="http://schemas.openxmlformats.org/officeDocument/2006/math" xmlns:v="urn:schemas-microsoft-com:vml" xmlns:wp14="http://schemas.microsoft.com/office/word/2010/wordprocessingDrawing" xmlns:wp="http://schemas.openxmlformats.org/drawingml/2006/wordprocessingDrawing" xmlns:w10="urn:schemas-microsoft-com:office:word" xmlns:w="http://schemas.openxmlformats.org/wordprocessingml/2006/main" xmlns:w14="http://schemas.microsoft.com/office/word/2010/wordml" xmlns:w15="http://schemas.microsoft.com/office/word/2012/wordml" xmlns:w16cex="http://schemas.microsoft.com/office/word/2018/wordml/cex" xmlns:w16cid="http://schemas.microsoft.com/office/word/2016/wordml/cid" xmlns:w16="http://schemas.microsoft.com/office/word/2018/wordml" xmlns:w16du="http://schemas.microsoft.com/office/word/2023/wordml/word16du" xmlns:w16sdtdh="http://schemas.microsoft.com/office/word/2020/wordml/sdtdatahash" xmlns:w16sdtfl="http://schemas.microsoft.com/office/word/2024/wordml/sdtformatlock" xmlns:w16se="http://schemas.microsoft.com/office/word/2015/wordml/symex" xmlns:wpg="http://schemas.microsoft.com/office/word/2010/wordprocessingGroup" xmlns:wpi="http://schemas.microsoft.com/office/word/2010/wordprocessingInk" xmlns:wne="http://schemas.microsoft.com/office/word/2006/wordml" xmlns:wps="http://schemas.microsoft.com/office/word/2010/wordprocessingShape" mc:Ignorable="w14 w15 w16se w16cid w16 w16cex w16sdtdh w16sdtfl w16du wp14">
+<w:hdr xmlns:o="urn:schemas-microsoft-com:office:office" xmlns:r="http://schemas.openxmlformats.org/officeDocument/2006/relationships" xmlns:v="urn:schemas-microsoft-com:vml" xmlns:w="http://schemas.openxmlformats.org/wordprocessingml/2006/main" xmlns:w10="urn:schemas-microsoft-com:office:word" xmlns:wp="http://schemas.openxmlformats.org/drawingml/2006/wordprocessingDrawing" xmlns:pic="http://schemas.openxmlformats.org/drawingml/2006/picture" xmlns:wps="http://schemas.microsoft.com/office/word/2010/wordprocessingShape" xmlns:wpg="http://schemas.microsoft.com/office/word/2010/wordprocessingGroup" xmlns:mc="http://schemas.openxmlformats.org/markup-compatibility/2006" xmlns:wp14="http://schemas.microsoft.com/office/word/2010/wordprocessingDrawing" xmlns:w14="http://schemas.microsoft.com/office/word/2010/wordml" xmlns:w15="http://schemas.microsoft.com/office/word/2012/wordml" mc:Ignorable="w14 wp14 w15">
   <w:p>
     <w:pPr>
-      <w:pStyle w:val="a"/>
-      <w:snapToGrid/>
+      <w:pStyle w:val="Style13"/>
+      <w:snapToGrid w:val="true"/>
       <w:rPr>
         <w:rFonts w:hint="eastAsia"/>
       </w:rPr>
     </w:pPr>
     <w:r>
-      <w:rPr>
-        <w:noProof/>
-      </w:rPr>
+      <w:rPr/>
       <w:drawing>
-        <wp:inline distT="0" distB="0" distL="0" distR="0" wp14:anchorId="0AA79803" wp14:editId="5A7F5B44">
+        <wp:inline distT="0" distB="0" distL="0" distR="0">
           <wp:extent cx="857250" cy="266700"/>
           <wp:effectExtent l="0" t="0" r="0" b="0"/>
           <wp:docPr id="2" name="그림 1"/>
@@ -1772,408 +1980,267 @@
   <w:p>
     <w:pPr>
       <w:pStyle w:val="Header"/>
+      <w:rPr/>
     </w:pPr>
+    <w:r>
+      <w:rPr/>
+    </w:r>
   </w:p>
 </w:hdr>
 </file>
 
 <file path=word/numbering.xml><?xml version="1.0" encoding="utf-8"?>
-<w:numbering xmlns:wpc="http://schemas.microsoft.com/office/word/2010/wordprocessingCanvas" xmlns:cx="http://schemas.microsoft.com/office/drawing/2014/chartex" xmlns:cx1="http://schemas.microsoft.com/office/drawing/2015/9/8/chartex" xmlns:cx2="http://schemas.microsoft.com/office/drawing/2015/10/21/chartex" xmlns:cx3="http://schemas.microsoft.com/office/drawing/2016/5/9/chartex" xmlns:cx4="http://schemas.microsoft.com/office/drawing/2016/5/10/chartex" xmlns:cx5="http://schemas.microsoft.com/office/drawing/2016/5/11/chartex" xmlns:cx6="http://schemas.microsoft.com/office/drawing/2016/5/12/chartex" xmlns:cx7="http://schemas.microsoft.com/office/drawing/2016/5/13/chartex" xmlns:cx8="http://schemas.microsoft.com/office/drawing/2016/5/14/chartex" xmlns:mc="http://schemas.openxmlformats.org/markup-compatibility/2006" xmlns:aink="http://schemas.microsoft.com/office/drawing/2016/ink" xmlns:am3d="http://schemas.microsoft.com/office/drawing/2017/model3d" xmlns:o="urn:schemas-microsoft-com:office:office" xmlns:oel="http://schemas.microsoft.com/office/2019/extlst" xmlns:r="http://schemas.openxmlformats.org/officeDocument/2006/relationships" xmlns:m="http://schemas.openxmlformats.org/officeDocument/2006/math" xmlns:v="urn:schemas-microsoft-com:vml" xmlns:wp14="http://schemas.microsoft.com/office/word/2010/wordprocessingDrawing" xmlns:wp="http://schemas.openxmlformats.org/drawingml/2006/wordprocessingDrawing" xmlns:w10="urn:schemas-microsoft-com:office:word" xmlns:w="http://schemas.openxmlformats.org/wordprocessingml/2006/main" xmlns:w14="http://schemas.microsoft.com/office/word/2010/wordml" xmlns:w15="http://schemas.microsoft.com/office/word/2012/wordml" xmlns:w16cex="http://schemas.microsoft.com/office/word/2018/wordml/cex" xmlns:w16cid="http://schemas.microsoft.com/office/word/2016/wordml/cid" xmlns:w16="http://schemas.microsoft.com/office/word/2018/wordml" xmlns:w16du="http://schemas.microsoft.com/office/word/2023/wordml/word16du" xmlns:w16sdtdh="http://schemas.microsoft.com/office/word/2020/wordml/sdtdatahash" xmlns:w16sdtfl="http://schemas.microsoft.com/office/word/2024/wordml/sdtformatlock" xmlns:w16se="http://schemas.microsoft.com/office/word/2015/wordml/symex" xmlns:wpg="http://schemas.microsoft.com/office/word/2010/wordprocessingGroup" xmlns:wpi="http://schemas.microsoft.com/office/word/2010/wordprocessingInk" xmlns:wne="http://schemas.microsoft.com/office/word/2006/wordml" xmlns:wps="http://schemas.microsoft.com/office/word/2010/wordprocessingShape" mc:Ignorable="w14 w15 w16se w16cid w16 w16cex w16sdtdh w16sdtfl w16du wp14">
-  <w:abstractNum w:abstractNumId="0" w15:restartNumberingAfterBreak="0">
-    <w:nsid w:val="062F7B89"/>
-    <w:multiLevelType w:val="hybridMultilevel"/>
-    <w:tmpl w:val="51B8672A"/>
-    <w:lvl w:ilvl="0" w:tplc="0409000F">
-      <w:start w:val="1"/>
-      <w:numFmt w:val="decimal"/>
-      <w:lvlText w:val="%1."/>
-      <w:lvlJc w:val="left"/>
-      <w:pPr>
-        <w:ind w:left="720" w:hanging="360"/>
-      </w:pPr>
-      <w:rPr>
-        <w:rFonts w:hint="default"/>
-      </w:rPr>
-    </w:lvl>
-    <w:lvl w:ilvl="1" w:tplc="04090019" w:tentative="1">
-      <w:start w:val="1"/>
-      <w:numFmt w:val="lowerLetter"/>
-      <w:lvlText w:val="%2."/>
-      <w:lvlJc w:val="left"/>
-      <w:pPr>
-        <w:ind w:left="1440" w:hanging="360"/>
-      </w:pPr>
-    </w:lvl>
-    <w:lvl w:ilvl="2" w:tplc="0409001B" w:tentative="1">
-      <w:start w:val="1"/>
-      <w:numFmt w:val="lowerRoman"/>
-      <w:lvlText w:val="%3."/>
-      <w:lvlJc w:val="right"/>
-      <w:pPr>
-        <w:ind w:left="2160" w:hanging="180"/>
-      </w:pPr>
-    </w:lvl>
-    <w:lvl w:ilvl="3" w:tplc="0409000F" w:tentative="1">
-      <w:start w:val="1"/>
-      <w:numFmt w:val="decimal"/>
-      <w:lvlText w:val="%4."/>
-      <w:lvlJc w:val="left"/>
-      <w:pPr>
-        <w:ind w:left="2880" w:hanging="360"/>
-      </w:pPr>
-    </w:lvl>
-    <w:lvl w:ilvl="4" w:tplc="04090019" w:tentative="1">
-      <w:start w:val="1"/>
-      <w:numFmt w:val="lowerLetter"/>
-      <w:lvlText w:val="%5."/>
-      <w:lvlJc w:val="left"/>
-      <w:pPr>
-        <w:ind w:left="3600" w:hanging="360"/>
-      </w:pPr>
-    </w:lvl>
-    <w:lvl w:ilvl="5" w:tplc="0409001B" w:tentative="1">
-      <w:start w:val="1"/>
-      <w:numFmt w:val="lowerRoman"/>
-      <w:lvlText w:val="%6."/>
-      <w:lvlJc w:val="right"/>
-      <w:pPr>
-        <w:ind w:left="4320" w:hanging="180"/>
-      </w:pPr>
-    </w:lvl>
-    <w:lvl w:ilvl="6" w:tplc="0409000F" w:tentative="1">
-      <w:start w:val="1"/>
-      <w:numFmt w:val="decimal"/>
-      <w:lvlText w:val="%7."/>
-      <w:lvlJc w:val="left"/>
-      <w:pPr>
-        <w:ind w:left="5040" w:hanging="360"/>
-      </w:pPr>
-    </w:lvl>
-    <w:lvl w:ilvl="7" w:tplc="04090019" w:tentative="1">
-      <w:start w:val="1"/>
-      <w:numFmt w:val="lowerLetter"/>
-      <w:lvlText w:val="%8."/>
-      <w:lvlJc w:val="left"/>
-      <w:pPr>
-        <w:ind w:left="5760" w:hanging="360"/>
-      </w:pPr>
-    </w:lvl>
-    <w:lvl w:ilvl="8" w:tplc="0409001B" w:tentative="1">
-      <w:start w:val="1"/>
-      <w:numFmt w:val="lowerRoman"/>
-      <w:lvlText w:val="%9."/>
-      <w:lvlJc w:val="right"/>
-      <w:pPr>
-        <w:ind w:left="6480" w:hanging="180"/>
-      </w:pPr>
-    </w:lvl>
-  </w:abstractNum>
-  <w:abstractNum w:abstractNumId="1" w15:restartNumberingAfterBreak="0">
-    <w:nsid w:val="19F7456A"/>
-    <w:multiLevelType w:val="hybridMultilevel"/>
-    <w:tmpl w:val="B6460D1E"/>
-    <w:lvl w:ilvl="0" w:tplc="0409000F">
-      <w:start w:val="1"/>
-      <w:numFmt w:val="decimal"/>
-      <w:lvlText w:val="%1."/>
-      <w:lvlJc w:val="left"/>
-      <w:pPr>
-        <w:ind w:left="720" w:hanging="360"/>
-      </w:pPr>
-      <w:rPr>
-        <w:rFonts w:hint="default"/>
-      </w:rPr>
-    </w:lvl>
-    <w:lvl w:ilvl="1" w:tplc="04090019" w:tentative="1">
-      <w:start w:val="1"/>
-      <w:numFmt w:val="lowerLetter"/>
-      <w:lvlText w:val="%2."/>
-      <w:lvlJc w:val="left"/>
-      <w:pPr>
-        <w:ind w:left="1440" w:hanging="360"/>
-      </w:pPr>
-    </w:lvl>
-    <w:lvl w:ilvl="2" w:tplc="0409001B" w:tentative="1">
-      <w:start w:val="1"/>
-      <w:numFmt w:val="lowerRoman"/>
-      <w:lvlText w:val="%3."/>
-      <w:lvlJc w:val="right"/>
-      <w:pPr>
-        <w:ind w:left="2160" w:hanging="180"/>
-      </w:pPr>
-    </w:lvl>
-    <w:lvl w:ilvl="3" w:tplc="0409000F" w:tentative="1">
-      <w:start w:val="1"/>
-      <w:numFmt w:val="decimal"/>
-      <w:lvlText w:val="%4."/>
-      <w:lvlJc w:val="left"/>
-      <w:pPr>
-        <w:ind w:left="2880" w:hanging="360"/>
-      </w:pPr>
-    </w:lvl>
-    <w:lvl w:ilvl="4" w:tplc="04090019" w:tentative="1">
-      <w:start w:val="1"/>
-      <w:numFmt w:val="lowerLetter"/>
-      <w:lvlText w:val="%5."/>
-      <w:lvlJc w:val="left"/>
-      <w:pPr>
-        <w:ind w:left="3600" w:hanging="360"/>
-      </w:pPr>
-    </w:lvl>
-    <w:lvl w:ilvl="5" w:tplc="0409001B" w:tentative="1">
-      <w:start w:val="1"/>
-      <w:numFmt w:val="lowerRoman"/>
-      <w:lvlText w:val="%6."/>
-      <w:lvlJc w:val="right"/>
-      <w:pPr>
-        <w:ind w:left="4320" w:hanging="180"/>
-      </w:pPr>
-    </w:lvl>
-    <w:lvl w:ilvl="6" w:tplc="0409000F" w:tentative="1">
-      <w:start w:val="1"/>
-      <w:numFmt w:val="decimal"/>
-      <w:lvlText w:val="%7."/>
-      <w:lvlJc w:val="left"/>
-      <w:pPr>
-        <w:ind w:left="5040" w:hanging="360"/>
-      </w:pPr>
-    </w:lvl>
-    <w:lvl w:ilvl="7" w:tplc="04090019" w:tentative="1">
-      <w:start w:val="1"/>
-      <w:numFmt w:val="lowerLetter"/>
-      <w:lvlText w:val="%8."/>
-      <w:lvlJc w:val="left"/>
-      <w:pPr>
-        <w:ind w:left="5760" w:hanging="360"/>
-      </w:pPr>
-    </w:lvl>
-    <w:lvl w:ilvl="8" w:tplc="0409001B" w:tentative="1">
-      <w:start w:val="1"/>
-      <w:numFmt w:val="lowerRoman"/>
-      <w:lvlText w:val="%9."/>
-      <w:lvlJc w:val="right"/>
-      <w:pPr>
-        <w:ind w:left="6480" w:hanging="180"/>
-      </w:pPr>
-    </w:lvl>
-  </w:abstractNum>
-  <w:abstractNum w:abstractNumId="2" w15:restartNumberingAfterBreak="0">
-    <w:nsid w:val="42697ADD"/>
-    <w:multiLevelType w:val="multilevel"/>
-    <w:tmpl w:val="55DAE168"/>
+<w:numbering xmlns:w="http://schemas.openxmlformats.org/wordprocessingml/2006/main" xmlns:o="urn:schemas-microsoft-com:office:office" xmlns:r="http://schemas.openxmlformats.org/officeDocument/2006/relationships" xmlns:v="urn:schemas-microsoft-com:vml" xmlns:mc="http://schemas.openxmlformats.org/markup-compatibility/2006" xmlns:w14="http://schemas.microsoft.com/office/word/2010/wordml" mc:Ignorable="w14">
+  <w:abstractNum w:abstractNumId="1">
     <w:lvl w:ilvl="0">
       <w:start w:val="1"/>
       <w:numFmt w:val="decimal"/>
       <w:lvlText w:val="%1."/>
-      <w:lvlJc w:val="left"/>
+      <w:lvlJc w:val="start"/>
       <w:pPr>
         <w:tabs>
           <w:tab w:val="num" w:pos="0"/>
         </w:tabs>
-        <w:ind w:left="720" w:hanging="360"/>
+        <w:ind w:start="720" w:hanging="360"/>
       </w:pPr>
+      <w:rPr/>
     </w:lvl>
     <w:lvl w:ilvl="1">
       <w:start w:val="1"/>
       <w:numFmt w:val="lowerLetter"/>
       <w:lvlText w:val="%2."/>
-      <w:lvlJc w:val="left"/>
+      <w:lvlJc w:val="start"/>
       <w:pPr>
         <w:tabs>
           <w:tab w:val="num" w:pos="0"/>
         </w:tabs>
-        <w:ind w:left="1440" w:hanging="360"/>
+        <w:ind w:start="1440" w:hanging="360"/>
       </w:pPr>
+      <w:rPr/>
     </w:lvl>
     <w:lvl w:ilvl="2">
       <w:start w:val="1"/>
       <w:numFmt w:val="lowerRoman"/>
       <w:lvlText w:val="%3."/>
-      <w:lvlJc w:val="right"/>
+      <w:lvlJc w:val="end"/>
       <w:pPr>
         <w:tabs>
           <w:tab w:val="num" w:pos="0"/>
         </w:tabs>
-        <w:ind w:left="2160" w:hanging="180"/>
+        <w:ind w:start="2160" w:hanging="180"/>
       </w:pPr>
+      <w:rPr/>
     </w:lvl>
     <w:lvl w:ilvl="3">
       <w:start w:val="1"/>
       <w:numFmt w:val="decimal"/>
       <w:lvlText w:val="%4."/>
-      <w:lvlJc w:val="left"/>
+      <w:lvlJc w:val="start"/>
       <w:pPr>
         <w:tabs>
           <w:tab w:val="num" w:pos="0"/>
         </w:tabs>
-        <w:ind w:left="2880" w:hanging="360"/>
+        <w:ind w:start="2880" w:hanging="360"/>
       </w:pPr>
+      <w:rPr/>
     </w:lvl>
     <w:lvl w:ilvl="4">
       <w:start w:val="1"/>
       <w:numFmt w:val="lowerLetter"/>
       <w:lvlText w:val="%5."/>
-      <w:lvlJc w:val="left"/>
+      <w:lvlJc w:val="start"/>
       <w:pPr>
         <w:tabs>
           <w:tab w:val="num" w:pos="0"/>
         </w:tabs>
-        <w:ind w:left="3600" w:hanging="360"/>
+        <w:ind w:start="3600" w:hanging="360"/>
       </w:pPr>
+      <w:rPr/>
     </w:lvl>
     <w:lvl w:ilvl="5">
       <w:start w:val="1"/>
       <w:numFmt w:val="lowerRoman"/>
       <w:lvlText w:val="%6."/>
-      <w:lvlJc w:val="right"/>
+      <w:lvlJc w:val="end"/>
       <w:pPr>
         <w:tabs>
           <w:tab w:val="num" w:pos="0"/>
         </w:tabs>
-        <w:ind w:left="4320" w:hanging="180"/>
+        <w:ind w:start="4320" w:hanging="180"/>
       </w:pPr>
+      <w:rPr/>
     </w:lvl>
     <w:lvl w:ilvl="6">
       <w:start w:val="1"/>
       <w:numFmt w:val="decimal"/>
       <w:lvlText w:val="%7."/>
-      <w:lvlJc w:val="left"/>
+      <w:lvlJc w:val="start"/>
       <w:pPr>
         <w:tabs>
           <w:tab w:val="num" w:pos="0"/>
         </w:tabs>
-        <w:ind w:left="5040" w:hanging="360"/>
+        <w:ind w:start="5040" w:hanging="360"/>
       </w:pPr>
+      <w:rPr/>
     </w:lvl>
     <w:lvl w:ilvl="7">
       <w:start w:val="1"/>
       <w:numFmt w:val="lowerLetter"/>
       <w:lvlText w:val="%8."/>
-      <w:lvlJc w:val="left"/>
+      <w:lvlJc w:val="start"/>
       <w:pPr>
         <w:tabs>
           <w:tab w:val="num" w:pos="0"/>
         </w:tabs>
-        <w:ind w:left="5760" w:hanging="360"/>
+        <w:ind w:start="5760" w:hanging="360"/>
       </w:pPr>
+      <w:rPr/>
     </w:lvl>
     <w:lvl w:ilvl="8">
       <w:start w:val="1"/>
       <w:numFmt w:val="lowerRoman"/>
       <w:lvlText w:val="%9."/>
-      <w:lvlJc w:val="right"/>
+      <w:lvlJc w:val="end"/>
       <w:pPr>
         <w:tabs>
           <w:tab w:val="num" w:pos="0"/>
         </w:tabs>
-        <w:ind w:left="6480" w:hanging="180"/>
+        <w:ind w:start="6480" w:hanging="180"/>
       </w:pPr>
+      <w:rPr/>
     </w:lvl>
   </w:abstractNum>
-  <w:abstractNum w:abstractNumId="3" w15:restartNumberingAfterBreak="0">
-    <w:nsid w:val="46F30FF9"/>
-    <w:multiLevelType w:val="hybridMultilevel"/>
-    <w:tmpl w:val="E948210C"/>
-    <w:lvl w:ilvl="0" w:tplc="0409000F">
+  <w:abstractNum w:abstractNumId="2">
+    <w:lvl w:ilvl="0">
       <w:start w:val="1"/>
       <w:numFmt w:val="decimal"/>
       <w:lvlText w:val="%1."/>
-      <w:lvlJc w:val="left"/>
+      <w:lvlJc w:val="start"/>
       <w:pPr>
-        <w:ind w:left="720" w:hanging="360"/>
+        <w:tabs>
+          <w:tab w:val="num" w:pos="0"/>
+        </w:tabs>
+        <w:ind w:start="720" w:hanging="360"/>
       </w:pPr>
-      <w:rPr>
-        <w:rFonts w:hint="default"/>
-      </w:rPr>
+      <w:rPr/>
     </w:lvl>
-    <w:lvl w:ilvl="1" w:tplc="04090019" w:tentative="1">
+    <w:lvl w:ilvl="1">
       <w:start w:val="1"/>
       <w:numFmt w:val="lowerLetter"/>
       <w:lvlText w:val="%2."/>
-      <w:lvlJc w:val="left"/>
+      <w:lvlJc w:val="start"/>
       <w:pPr>
-        <w:ind w:left="1440" w:hanging="360"/>
+        <w:tabs>
+          <w:tab w:val="num" w:pos="0"/>
+        </w:tabs>
+        <w:ind w:start="1440" w:hanging="360"/>
       </w:pPr>
+      <w:rPr/>
     </w:lvl>
-    <w:lvl w:ilvl="2" w:tplc="0409001B" w:tentative="1">
+    <w:lvl w:ilvl="2">
       <w:start w:val="1"/>
       <w:numFmt w:val="lowerRoman"/>
       <w:lvlText w:val="%3."/>
-      <w:lvlJc w:val="right"/>
+      <w:lvlJc w:val="end"/>
       <w:pPr>
-        <w:ind w:left="2160" w:hanging="180"/>
+        <w:tabs>
+          <w:tab w:val="num" w:pos="0"/>
+        </w:tabs>
+        <w:ind w:start="2160" w:hanging="180"/>
       </w:pPr>
+      <w:rPr/>
     </w:lvl>
-    <w:lvl w:ilvl="3" w:tplc="0409000F" w:tentative="1">
+    <w:lvl w:ilvl="3">
       <w:start w:val="1"/>
       <w:numFmt w:val="decimal"/>
       <w:lvlText w:val="%4."/>
-      <w:lvlJc w:val="left"/>
+      <w:lvlJc w:val="start"/>
       <w:pPr>
-        <w:ind w:left="2880" w:hanging="360"/>
+        <w:tabs>
+          <w:tab w:val="num" w:pos="0"/>
+        </w:tabs>
+        <w:ind w:start="2880" w:hanging="360"/>
       </w:pPr>
+      <w:rPr/>
     </w:lvl>
-    <w:lvl w:ilvl="4" w:tplc="04090019" w:tentative="1">
+    <w:lvl w:ilvl="4">
       <w:start w:val="1"/>
       <w:numFmt w:val="lowerLetter"/>
       <w:lvlText w:val="%5."/>
-      <w:lvlJc w:val="left"/>
+      <w:lvlJc w:val="start"/>
       <w:pPr>
-        <w:ind w:left="3600" w:hanging="360"/>
+        <w:tabs>
+          <w:tab w:val="num" w:pos="0"/>
+        </w:tabs>
+        <w:ind w:start="3600" w:hanging="360"/>
       </w:pPr>
+      <w:rPr/>
     </w:lvl>
-    <w:lvl w:ilvl="5" w:tplc="0409001B" w:tentative="1">
+    <w:lvl w:ilvl="5">
       <w:start w:val="1"/>
       <w:numFmt w:val="lowerRoman"/>
       <w:lvlText w:val="%6."/>
-      <w:lvlJc w:val="right"/>
+      <w:lvlJc w:val="end"/>
       <w:pPr>
-        <w:ind w:left="4320" w:hanging="180"/>
+        <w:tabs>
+          <w:tab w:val="num" w:pos="0"/>
+        </w:tabs>
+        <w:ind w:start="4320" w:hanging="180"/>
       </w:pPr>
+      <w:rPr/>
     </w:lvl>
-    <w:lvl w:ilvl="6" w:tplc="0409000F" w:tentative="1">
+    <w:lvl w:ilvl="6">
       <w:start w:val="1"/>
       <w:numFmt w:val="decimal"/>
       <w:lvlText w:val="%7."/>
-      <w:lvlJc w:val="left"/>
+      <w:lvlJc w:val="start"/>
       <w:pPr>
-        <w:ind w:left="5040" w:hanging="360"/>
+        <w:tabs>
+          <w:tab w:val="num" w:pos="0"/>
+        </w:tabs>
+        <w:ind w:start="5040" w:hanging="360"/>
       </w:pPr>
+      <w:rPr/>
     </w:lvl>
-    <w:lvl w:ilvl="7" w:tplc="04090019" w:tentative="1">
+    <w:lvl w:ilvl="7">
       <w:start w:val="1"/>
       <w:numFmt w:val="lowerLetter"/>
       <w:lvlText w:val="%8."/>
-      <w:lvlJc w:val="left"/>
+      <w:lvlJc w:val="start"/>
       <w:pPr>
-        <w:ind w:left="5760" w:hanging="360"/>
+        <w:tabs>
+          <w:tab w:val="num" w:pos="0"/>
+        </w:tabs>
+        <w:ind w:start="5760" w:hanging="360"/>
       </w:pPr>
+      <w:rPr/>
     </w:lvl>
-    <w:lvl w:ilvl="8" w:tplc="0409001B" w:tentative="1">
+    <w:lvl w:ilvl="8">
       <w:start w:val="1"/>
       <w:numFmt w:val="lowerRoman"/>
       <w:lvlText w:val="%9."/>
-      <w:lvlJc w:val="right"/>
+      <w:lvlJc w:val="end"/>
       <w:pPr>
-        <w:ind w:left="6480" w:hanging="180"/>
+        <w:tabs>
+          <w:tab w:val="num" w:pos="0"/>
+        </w:tabs>
+        <w:ind w:start="6480" w:hanging="180"/>
       </w:pPr>
+      <w:rPr/>
     </w:lvl>
   </w:abstractNum>
-  <w:abstractNum w:abstractNumId="4" w15:restartNumberingAfterBreak="0">
-    <w:nsid w:val="520E215E"/>
-    <w:multiLevelType w:val="multilevel"/>
-    <w:tmpl w:val="7D128B42"/>
+  <w:abstractNum w:abstractNumId="3">
     <w:lvl w:ilvl="0">
       <w:start w:val="1"/>
       <w:numFmt w:val="none"/>
       <w:suff w:val="nothing"/>
       <w:lvlText w:val=""/>
-      <w:lvlJc w:val="left"/>
+      <w:lvlJc w:val="start"/>
       <w:pPr>
         <w:tabs>
           <w:tab w:val="num" w:pos="0"/>
         </w:tabs>
-        <w:ind w:left="0" w:firstLine="0"/>
+        <w:ind w:start="0" w:hanging="0"/>
       </w:pPr>
     </w:lvl>
     <w:lvl w:ilvl="1">
@@ -2181,12 +2248,12 @@
       <w:numFmt w:val="none"/>
       <w:suff w:val="nothing"/>
       <w:lvlText w:val=""/>
-      <w:lvlJc w:val="left"/>
+      <w:lvlJc w:val="start"/>
       <w:pPr>
         <w:tabs>
           <w:tab w:val="num" w:pos="0"/>
         </w:tabs>
-        <w:ind w:left="0" w:firstLine="0"/>
+        <w:ind w:start="0" w:hanging="0"/>
       </w:pPr>
     </w:lvl>
     <w:lvl w:ilvl="2">
@@ -2194,12 +2261,12 @@
       <w:numFmt w:val="none"/>
       <w:suff w:val="nothing"/>
       <w:lvlText w:val=""/>
-      <w:lvlJc w:val="left"/>
+      <w:lvlJc w:val="start"/>
       <w:pPr>
         <w:tabs>
           <w:tab w:val="num" w:pos="0"/>
         </w:tabs>
-        <w:ind w:left="0" w:firstLine="0"/>
+        <w:ind w:start="0" w:hanging="0"/>
       </w:pPr>
     </w:lvl>
     <w:lvl w:ilvl="3">
@@ -2207,12 +2274,12 @@
       <w:numFmt w:val="none"/>
       <w:suff w:val="nothing"/>
       <w:lvlText w:val=""/>
-      <w:lvlJc w:val="left"/>
+      <w:lvlJc w:val="start"/>
       <w:pPr>
         <w:tabs>
           <w:tab w:val="num" w:pos="0"/>
         </w:tabs>
-        <w:ind w:left="0" w:firstLine="0"/>
+        <w:ind w:start="0" w:hanging="0"/>
       </w:pPr>
     </w:lvl>
     <w:lvl w:ilvl="4">
@@ -2220,12 +2287,12 @@
       <w:numFmt w:val="none"/>
       <w:suff w:val="nothing"/>
       <w:lvlText w:val=""/>
-      <w:lvlJc w:val="left"/>
+      <w:lvlJc w:val="start"/>
       <w:pPr>
         <w:tabs>
           <w:tab w:val="num" w:pos="0"/>
         </w:tabs>
-        <w:ind w:left="0" w:firstLine="0"/>
+        <w:ind w:start="0" w:hanging="0"/>
       </w:pPr>
     </w:lvl>
     <w:lvl w:ilvl="5">
@@ -2233,12 +2300,12 @@
       <w:numFmt w:val="none"/>
       <w:suff w:val="nothing"/>
       <w:lvlText w:val=""/>
-      <w:lvlJc w:val="left"/>
+      <w:lvlJc w:val="start"/>
       <w:pPr>
         <w:tabs>
           <w:tab w:val="num" w:pos="0"/>
         </w:tabs>
-        <w:ind w:left="0" w:firstLine="0"/>
+        <w:ind w:start="0" w:hanging="0"/>
       </w:pPr>
     </w:lvl>
     <w:lvl w:ilvl="6">
@@ -2246,12 +2313,12 @@
       <w:numFmt w:val="none"/>
       <w:suff w:val="nothing"/>
       <w:lvlText w:val=""/>
-      <w:lvlJc w:val="left"/>
+      <w:lvlJc w:val="start"/>
       <w:pPr>
         <w:tabs>
           <w:tab w:val="num" w:pos="0"/>
         </w:tabs>
-        <w:ind w:left="0" w:firstLine="0"/>
+        <w:ind w:start="0" w:hanging="0"/>
       </w:pPr>
     </w:lvl>
     <w:lvl w:ilvl="7">
@@ -2259,12 +2326,12 @@
       <w:numFmt w:val="none"/>
       <w:suff w:val="nothing"/>
       <w:lvlText w:val=""/>
-      <w:lvlJc w:val="left"/>
+      <w:lvlJc w:val="start"/>
       <w:pPr>
         <w:tabs>
           <w:tab w:val="num" w:pos="0"/>
         </w:tabs>
-        <w:ind w:left="0" w:firstLine="0"/>
+        <w:ind w:start="0" w:hanging="0"/>
       </w:pPr>
     </w:lvl>
     <w:lvl w:ilvl="8">
@@ -2272,39 +2339,33 @@
       <w:numFmt w:val="none"/>
       <w:suff w:val="nothing"/>
       <w:lvlText w:val=""/>
-      <w:lvlJc w:val="left"/>
+      <w:lvlJc w:val="start"/>
       <w:pPr>
         <w:tabs>
           <w:tab w:val="num" w:pos="0"/>
         </w:tabs>
-        <w:ind w:left="0" w:firstLine="0"/>
+        <w:ind w:start="0" w:hanging="0"/>
       </w:pPr>
     </w:lvl>
   </w:abstractNum>
-  <w:num w:numId="1" w16cid:durableId="976035010">
+  <w:num w:numId="1">
+    <w:abstractNumId w:val="1"/>
+  </w:num>
+  <w:num w:numId="2">
     <w:abstractNumId w:val="2"/>
   </w:num>
-  <w:num w:numId="2" w16cid:durableId="1687293423">
-    <w:abstractNumId w:val="4"/>
-  </w:num>
-  <w:num w:numId="3" w16cid:durableId="21051781">
+  <w:num w:numId="3">
     <w:abstractNumId w:val="3"/>
-  </w:num>
-  <w:num w:numId="4" w16cid:durableId="1617370568">
-    <w:abstractNumId w:val="0"/>
-  </w:num>
-  <w:num w:numId="5" w16cid:durableId="1412847163">
-    <w:abstractNumId w:val="1"/>
   </w:num>
 </w:numbering>
 </file>
 
 <file path=word/styles.xml><?xml version="1.0" encoding="utf-8"?>
-<w:styles xmlns:mc="http://schemas.openxmlformats.org/markup-compatibility/2006" xmlns:r="http://schemas.openxmlformats.org/officeDocument/2006/relationships" xmlns:w="http://schemas.openxmlformats.org/wordprocessingml/2006/main" xmlns:w14="http://schemas.microsoft.com/office/word/2010/wordml" xmlns:w15="http://schemas.microsoft.com/office/word/2012/wordml" xmlns:w16cex="http://schemas.microsoft.com/office/word/2018/wordml/cex" xmlns:w16cid="http://schemas.microsoft.com/office/word/2016/wordml/cid" xmlns:w16="http://schemas.microsoft.com/office/word/2018/wordml" xmlns:w16du="http://schemas.microsoft.com/office/word/2023/wordml/word16du" xmlns:w16sdtdh="http://schemas.microsoft.com/office/word/2020/wordml/sdtdatahash" xmlns:w16sdtfl="http://schemas.microsoft.com/office/word/2024/wordml/sdtformatlock" xmlns:w16se="http://schemas.microsoft.com/office/word/2015/wordml/symex" mc:Ignorable="w14 w15 w16se w16cid w16 w16cex w16sdtdh w16sdtfl w16du">
+<w:styles xmlns:w="http://schemas.openxmlformats.org/wordprocessingml/2006/main" xmlns:w14="http://schemas.microsoft.com/office/word/2010/wordml" xmlns:mc="http://schemas.openxmlformats.org/markup-compatibility/2006" mc:Ignorable="w14">
   <w:docDefaults>
     <w:rPrDefault>
       <w:rPr>
-        <w:rFonts w:asciiTheme="minorHAnsi" w:eastAsiaTheme="minorEastAsia" w:hAnsiTheme="minorHAnsi" w:cstheme="minorBidi"/>
+        <w:rFonts w:ascii="맑은 고딕" w:hAnsi="맑은 고딕" w:eastAsia="" w:cs="" w:asciiTheme="minorHAnsi" w:cstheme="minorBidi" w:eastAsiaTheme="minorEastAsia" w:hAnsiTheme="minorHAnsi"/>
         <w:kern w:val="2"/>
         <w:szCs w:val="22"/>
         <w:lang w:val="en-US" w:eastAsia="ko-KR" w:bidi="ar-SA"/>
@@ -2312,21 +2373,21 @@
     </w:rPrDefault>
     <w:pPrDefault>
       <w:pPr>
-        <w:suppressAutoHyphens/>
+        <w:suppressAutoHyphens w:val="true"/>
       </w:pPr>
     </w:pPrDefault>
   </w:docDefaults>
   <w:latentStyles w:defLockedState="0" w:defUIPriority="99" w:defSemiHidden="0" w:defUnhideWhenUsed="0" w:defQFormat="0" w:count="376">
     <w:lsdException w:name="Normal" w:uiPriority="0" w:qFormat="1"/>
     <w:lsdException w:name="heading 1" w:uiPriority="9" w:qFormat="1"/>
-    <w:lsdException w:name="heading 2" w:semiHidden="1" w:uiPriority="9" w:unhideWhenUsed="1" w:qFormat="1"/>
-    <w:lsdException w:name="heading 3" w:semiHidden="1" w:uiPriority="9" w:unhideWhenUsed="1" w:qFormat="1"/>
-    <w:lsdException w:name="heading 4" w:semiHidden="1" w:uiPriority="9" w:unhideWhenUsed="1" w:qFormat="1"/>
-    <w:lsdException w:name="heading 5" w:semiHidden="1" w:uiPriority="9" w:unhideWhenUsed="1" w:qFormat="1"/>
-    <w:lsdException w:name="heading 6" w:semiHidden="1" w:uiPriority="9" w:unhideWhenUsed="1" w:qFormat="1"/>
-    <w:lsdException w:name="heading 7" w:semiHidden="1" w:uiPriority="9" w:unhideWhenUsed="1" w:qFormat="1"/>
-    <w:lsdException w:name="heading 8" w:semiHidden="1" w:uiPriority="9" w:unhideWhenUsed="1" w:qFormat="1"/>
-    <w:lsdException w:name="heading 9" w:semiHidden="1" w:uiPriority="9" w:unhideWhenUsed="1" w:qFormat="1"/>
+    <w:lsdException w:name="heading 2" w:uiPriority="9" w:semiHidden="1" w:unhideWhenUsed="1" w:qFormat="1"/>
+    <w:lsdException w:name="heading 3" w:uiPriority="9" w:semiHidden="1" w:unhideWhenUsed="1" w:qFormat="1"/>
+    <w:lsdException w:name="heading 4" w:uiPriority="9" w:semiHidden="1" w:unhideWhenUsed="1" w:qFormat="1"/>
+    <w:lsdException w:name="heading 5" w:uiPriority="9" w:semiHidden="1" w:unhideWhenUsed="1" w:qFormat="1"/>
+    <w:lsdException w:name="heading 6" w:uiPriority="9" w:semiHidden="1" w:unhideWhenUsed="1" w:qFormat="1"/>
+    <w:lsdException w:name="heading 7" w:uiPriority="9" w:semiHidden="1" w:unhideWhenUsed="1" w:qFormat="1"/>
+    <w:lsdException w:name="heading 8" w:uiPriority="9" w:semiHidden="1" w:unhideWhenUsed="1" w:qFormat="1"/>
+    <w:lsdException w:name="heading 9" w:uiPriority="9" w:semiHidden="1" w:unhideWhenUsed="1" w:qFormat="1"/>
     <w:lsdException w:name="index 1" w:semiHidden="1" w:unhideWhenUsed="1"/>
     <w:lsdException w:name="index 2" w:semiHidden="1" w:unhideWhenUsed="1"/>
     <w:lsdException w:name="index 3" w:semiHidden="1" w:unhideWhenUsed="1"/>
@@ -2336,22 +2397,22 @@
     <w:lsdException w:name="index 7" w:semiHidden="1" w:unhideWhenUsed="1"/>
     <w:lsdException w:name="index 8" w:semiHidden="1" w:unhideWhenUsed="1"/>
     <w:lsdException w:name="index 9" w:semiHidden="1" w:unhideWhenUsed="1"/>
-    <w:lsdException w:name="toc 1" w:semiHidden="1" w:uiPriority="39" w:unhideWhenUsed="1"/>
-    <w:lsdException w:name="toc 2" w:semiHidden="1" w:uiPriority="39" w:unhideWhenUsed="1"/>
-    <w:lsdException w:name="toc 3" w:semiHidden="1" w:uiPriority="39" w:unhideWhenUsed="1"/>
-    <w:lsdException w:name="toc 4" w:semiHidden="1" w:uiPriority="39" w:unhideWhenUsed="1"/>
-    <w:lsdException w:name="toc 5" w:semiHidden="1" w:uiPriority="39" w:unhideWhenUsed="1"/>
-    <w:lsdException w:name="toc 6" w:semiHidden="1" w:uiPriority="39" w:unhideWhenUsed="1"/>
-    <w:lsdException w:name="toc 7" w:semiHidden="1" w:uiPriority="39" w:unhideWhenUsed="1"/>
-    <w:lsdException w:name="toc 8" w:semiHidden="1" w:uiPriority="39" w:unhideWhenUsed="1"/>
-    <w:lsdException w:name="toc 9" w:semiHidden="1" w:uiPriority="39" w:unhideWhenUsed="1"/>
+    <w:lsdException w:name="toc 1" w:uiPriority="39" w:semiHidden="1" w:unhideWhenUsed="1"/>
+    <w:lsdException w:name="toc 2" w:uiPriority="39" w:semiHidden="1" w:unhideWhenUsed="1"/>
+    <w:lsdException w:name="toc 3" w:uiPriority="39" w:semiHidden="1" w:unhideWhenUsed="1"/>
+    <w:lsdException w:name="toc 4" w:uiPriority="39" w:semiHidden="1" w:unhideWhenUsed="1"/>
+    <w:lsdException w:name="toc 5" w:uiPriority="39" w:semiHidden="1" w:unhideWhenUsed="1"/>
+    <w:lsdException w:name="toc 6" w:uiPriority="39" w:semiHidden="1" w:unhideWhenUsed="1"/>
+    <w:lsdException w:name="toc 7" w:uiPriority="39" w:semiHidden="1" w:unhideWhenUsed="1"/>
+    <w:lsdException w:name="toc 8" w:uiPriority="39" w:semiHidden="1" w:unhideWhenUsed="1"/>
+    <w:lsdException w:name="toc 9" w:uiPriority="39" w:semiHidden="1" w:unhideWhenUsed="1"/>
     <w:lsdException w:name="Normal Indent" w:semiHidden="1" w:unhideWhenUsed="1"/>
     <w:lsdException w:name="footnote text" w:semiHidden="1" w:unhideWhenUsed="1"/>
     <w:lsdException w:name="annotation text" w:semiHidden="1" w:unhideWhenUsed="1"/>
     <w:lsdException w:name="header" w:semiHidden="1" w:unhideWhenUsed="1"/>
     <w:lsdException w:name="footer" w:semiHidden="1" w:unhideWhenUsed="1"/>
     <w:lsdException w:name="index heading" w:semiHidden="1" w:unhideWhenUsed="1"/>
-    <w:lsdException w:name="caption" w:semiHidden="1" w:uiPriority="35" w:unhideWhenUsed="1" w:qFormat="1"/>
+    <w:lsdException w:name="caption" w:uiPriority="35" w:semiHidden="1" w:unhideWhenUsed="1" w:qFormat="1"/>
     <w:lsdException w:name="table of figures" w:semiHidden="1" w:unhideWhenUsed="1"/>
     <w:lsdException w:name="envelope address" w:semiHidden="1" w:unhideWhenUsed="1"/>
     <w:lsdException w:name="envelope return" w:semiHidden="1" w:unhideWhenUsed="1"/>
@@ -2382,7 +2443,7 @@
     <w:lsdException w:name="Title" w:uiPriority="10" w:qFormat="1"/>
     <w:lsdException w:name="Closing" w:semiHidden="1" w:unhideWhenUsed="1"/>
     <w:lsdException w:name="Signature" w:semiHidden="1" w:unhideWhenUsed="1"/>
-    <w:lsdException w:name="Default Paragraph Font" w:semiHidden="1" w:uiPriority="1" w:unhideWhenUsed="1"/>
+    <w:lsdException w:name="Default Paragraph Font" w:uiPriority="1" w:semiHidden="1" w:unhideWhenUsed="1"/>
     <w:lsdException w:name="Body Text" w:semiHidden="1" w:unhideWhenUsed="1"/>
     <w:lsdException w:name="Body Text Indent" w:semiHidden="1" w:unhideWhenUsed="1"/>
     <w:lsdException w:name="List Continue" w:semiHidden="1" w:unhideWhenUsed="1"/>
@@ -2582,8 +2643,8 @@
     <w:lsdException w:name="Subtle Reference" w:uiPriority="31" w:qFormat="1"/>
     <w:lsdException w:name="Intense Reference" w:uiPriority="32" w:qFormat="1"/>
     <w:lsdException w:name="Book Title" w:uiPriority="33" w:qFormat="1"/>
-    <w:lsdException w:name="Bibliography" w:semiHidden="1" w:uiPriority="37" w:unhideWhenUsed="1"/>
-    <w:lsdException w:name="TOC Heading" w:semiHidden="1" w:uiPriority="39" w:unhideWhenUsed="1" w:qFormat="1"/>
+    <w:lsdException w:name="Bibliography" w:uiPriority="37" w:semiHidden="1" w:unhideWhenUsed="1"/>
+    <w:lsdException w:name="TOC Heading" w:uiPriority="39" w:semiHidden="1" w:unhideWhenUsed="1" w:qFormat="1"/>
     <w:lsdException w:name="Plain Table 1" w:uiPriority="41"/>
     <w:lsdException w:name="Plain Table 2" w:uiPriority="42"/>
     <w:lsdException w:name="Plain Table 3" w:uiPriority="43"/>
@@ -2694,14 +2755,25 @@
     <w:lsdException w:name="Unresolved Mention" w:semiHidden="1" w:unhideWhenUsed="1"/>
     <w:lsdException w:name="Smart Link" w:semiHidden="1" w:unhideWhenUsed="1"/>
   </w:latentStyles>
-  <w:style w:type="paragraph" w:default="1" w:styleId="Normal">
+  <w:style w:type="paragraph" w:styleId="Normal" w:default="1">
     <w:name w:val="Normal"/>
     <w:qFormat/>
-    <w:rsid w:val="00CB2237"/>
+    <w:rsid w:val="00cb2237"/>
     <w:pPr>
-      <w:widowControl w:val="0"/>
+      <w:widowControl w:val="false"/>
+      <w:suppressAutoHyphens w:val="true"/>
+      <w:bidi w:val="0"/>
+      <w:spacing w:before="0" w:after="0"/>
       <w:jc w:val="both"/>
     </w:pPr>
+    <w:rPr>
+      <w:rFonts w:ascii="맑은 고딕" w:hAnsi="맑은 고딕" w:eastAsia="" w:cs="" w:asciiTheme="minorHAnsi" w:cstheme="minorBidi" w:eastAsiaTheme="minorEastAsia" w:hAnsiTheme="minorHAnsi"/>
+      <w:color w:val="auto"/>
+      <w:kern w:val="2"/>
+      <w:sz w:val="20"/>
+      <w:szCs w:val="22"/>
+      <w:lang w:val="en-US" w:eastAsia="ko-KR" w:bidi="ar-SA"/>
+    </w:rPr>
   </w:style>
   <w:style w:type="paragraph" w:styleId="Heading1">
     <w:name w:val="heading 1"/>
@@ -2719,64 +2791,48 @@
       <w:szCs w:val="48"/>
     </w:rPr>
   </w:style>
-  <w:style w:type="character" w:default="1" w:styleId="DefaultParagraphFont">
+  <w:style w:type="character" w:styleId="DefaultParagraphFont" w:default="1">
     <w:name w:val="Default Paragraph Font"/>
     <w:uiPriority w:val="1"/>
     <w:semiHidden/>
     <w:unhideWhenUsed/>
+    <w:qFormat/>
+    <w:rPr/>
   </w:style>
-  <w:style w:type="table" w:default="1" w:styleId="TableNormal">
-    <w:name w:val="Normal Table"/>
-    <w:uiPriority w:val="99"/>
-    <w:semiHidden/>
-    <w:unhideWhenUsed/>
-    <w:tblPr>
-      <w:tblInd w:w="0" w:type="dxa"/>
-      <w:tblCellMar>
-        <w:top w:w="0" w:type="dxa"/>
-        <w:left w:w="108" w:type="dxa"/>
-        <w:bottom w:w="0" w:type="dxa"/>
-        <w:right w:w="108" w:type="dxa"/>
-      </w:tblCellMar>
-    </w:tblPr>
-  </w:style>
-  <w:style w:type="numbering" w:default="1" w:styleId="NoList">
-    <w:name w:val="No List"/>
-    <w:uiPriority w:val="99"/>
-    <w:semiHidden/>
-    <w:unhideWhenUsed/>
-  </w:style>
-  <w:style w:type="character" w:customStyle="1" w:styleId="HeaderChar">
+  <w:style w:type="character" w:styleId="HeaderChar" w:customStyle="1">
     <w:name w:val="Header Char"/>
     <w:basedOn w:val="DefaultParagraphFont"/>
     <w:link w:val="Header"/>
     <w:uiPriority w:val="99"/>
     <w:qFormat/>
-    <w:rsid w:val="003759DD"/>
+    <w:rsid w:val="003759dd"/>
+    <w:rPr/>
   </w:style>
-  <w:style w:type="character" w:customStyle="1" w:styleId="FooterChar">
+  <w:style w:type="character" w:styleId="FooterChar" w:customStyle="1">
     <w:name w:val="Footer Char"/>
     <w:basedOn w:val="DefaultParagraphFont"/>
     <w:link w:val="Footer"/>
     <w:uiPriority w:val="99"/>
     <w:qFormat/>
-    <w:rsid w:val="003759DD"/>
+    <w:rsid w:val="003759dd"/>
+    <w:rPr/>
   </w:style>
-  <w:style w:type="character" w:customStyle="1" w:styleId="NumberingSymbols">
+  <w:style w:type="character" w:styleId="NumberingSymbols" w:customStyle="1">
     <w:name w:val="Numbering Symbols"/>
     <w:qFormat/>
+    <w:rPr/>
   </w:style>
-  <w:style w:type="paragraph" w:customStyle="1" w:styleId="Heading">
+  <w:style w:type="paragraph" w:styleId="Heading" w:customStyle="1">
     <w:name w:val="Heading"/>
     <w:basedOn w:val="Normal"/>
     <w:next w:val="BodyText"/>
     <w:qFormat/>
     <w:pPr>
-      <w:keepNext/>
+      <w:keepNext w:val="true"/>
       <w:spacing w:before="240" w:after="120"/>
     </w:pPr>
     <w:rPr>
-      <w:rFonts w:ascii="Liberation Sans" w:eastAsia="맑은 고딕" w:hAnsi="Liberation Sans" w:cs="Arial"/>
+      <w:rFonts w:ascii="Liberation Sans" w:hAnsi="Liberation Sans" w:eastAsia="맑은 고딕" w:cs="Arial"/>
       <w:sz w:val="28"/>
       <w:szCs w:val="28"/>
     </w:rPr>
@@ -2785,12 +2841,14 @@
     <w:name w:val="Body Text"/>
     <w:basedOn w:val="Normal"/>
     <w:pPr>
-      <w:spacing w:after="140" w:line="276" w:lineRule="auto"/>
+      <w:spacing w:lineRule="auto" w:line="276" w:before="0" w:after="140"/>
     </w:pPr>
+    <w:rPr/>
   </w:style>
   <w:style w:type="paragraph" w:styleId="List">
     <w:name w:val="List"/>
     <w:basedOn w:val="BodyText"/>
+    <w:pPr/>
     <w:rPr>
       <w:rFonts w:cs="Arial"/>
     </w:rPr>
@@ -2811,7 +2869,7 @@
       <w:szCs w:val="24"/>
     </w:rPr>
   </w:style>
-  <w:style w:type="paragraph" w:customStyle="1" w:styleId="Index">
+  <w:style w:type="paragraph" w:styleId="Index" w:customStyle="1">
     <w:name w:val="Index"/>
     <w:basedOn w:val="Normal"/>
     <w:qFormat/>
@@ -2822,10 +2880,12 @@
       <w:rFonts w:cs="Arial"/>
     </w:rPr>
   </w:style>
-  <w:style w:type="paragraph" w:customStyle="1" w:styleId="HeaderandFooter">
+  <w:style w:type="paragraph" w:styleId="HeaderandFooter" w:customStyle="1">
     <w:name w:val="Header and Footer"/>
     <w:basedOn w:val="Normal"/>
     <w:qFormat/>
+    <w:pPr/>
+    <w:rPr/>
   </w:style>
   <w:style w:type="paragraph" w:styleId="Header">
     <w:name w:val="header"/>
@@ -2833,14 +2893,16 @@
     <w:link w:val="HeaderChar"/>
     <w:uiPriority w:val="99"/>
     <w:unhideWhenUsed/>
-    <w:rsid w:val="003759DD"/>
+    <w:rsid w:val="003759dd"/>
     <w:pPr>
       <w:tabs>
-        <w:tab w:val="center" w:pos="4513"/>
-        <w:tab w:val="right" w:pos="9026"/>
+        <w:tab w:val="clear" w:pos="800"/>
+        <w:tab w:val="center" w:pos="4513" w:leader="none"/>
+        <w:tab w:val="right" w:pos="9026" w:leader="none"/>
       </w:tabs>
-      <w:snapToGrid w:val="0"/>
+      <w:snapToGrid w:val="false"/>
     </w:pPr>
+    <w:rPr/>
   </w:style>
   <w:style w:type="paragraph" w:styleId="Footer">
     <w:name w:val="footer"/>
@@ -2848,27 +2910,29 @@
     <w:link w:val="FooterChar"/>
     <w:uiPriority w:val="99"/>
     <w:unhideWhenUsed/>
-    <w:rsid w:val="003759DD"/>
+    <w:rsid w:val="003759dd"/>
     <w:pPr>
       <w:tabs>
-        <w:tab w:val="center" w:pos="4513"/>
-        <w:tab w:val="right" w:pos="9026"/>
+        <w:tab w:val="clear" w:pos="800"/>
+        <w:tab w:val="center" w:pos="4513" w:leader="none"/>
+        <w:tab w:val="right" w:pos="9026" w:leader="none"/>
       </w:tabs>
-      <w:snapToGrid w:val="0"/>
+      <w:snapToGrid w:val="false"/>
     </w:pPr>
+    <w:rPr/>
   </w:style>
-  <w:style w:type="paragraph" w:customStyle="1" w:styleId="a">
+  <w:style w:type="paragraph" w:styleId="Style13" w:customStyle="1">
     <w:name w:val="바탕글"/>
     <w:basedOn w:val="Normal"/>
     <w:qFormat/>
-    <w:rsid w:val="003759DD"/>
+    <w:rsid w:val="003759dd"/>
     <w:pPr>
-      <w:snapToGrid w:val="0"/>
-      <w:spacing w:line="384" w:lineRule="auto"/>
+      <w:snapToGrid w:val="false"/>
+      <w:spacing w:lineRule="auto" w:line="384"/>
       <w:textAlignment w:val="baseline"/>
     </w:pPr>
     <w:rPr>
-      <w:rFonts w:ascii="Arial Unicode MS" w:eastAsia="굴림" w:hAnsi="Arial Unicode MS" w:cs="굴림"/>
+      <w:rFonts w:ascii="Arial Unicode MS" w:hAnsi="Arial Unicode MS" w:eastAsia="굴림" w:cs="굴림"/>
       <w:color w:val="000000"/>
       <w:kern w:val="0"/>
       <w:szCs w:val="20"/>
@@ -2879,33 +2943,56 @@
     <w:basedOn w:val="Normal"/>
     <w:uiPriority w:val="34"/>
     <w:qFormat/>
-    <w:rsid w:val="004D67D3"/>
+    <w:rsid w:val="004d67d3"/>
     <w:pPr>
-      <w:ind w:leftChars="400" w:left="400"/>
+      <w:ind w:startChars="400"/>
     </w:pPr>
+    <w:rPr/>
   </w:style>
-  <w:style w:type="paragraph" w:customStyle="1" w:styleId="PreformattedText">
+  <w:style w:type="paragraph" w:styleId="PreformattedText" w:customStyle="1">
     <w:name w:val="Preformatted Text"/>
     <w:basedOn w:val="Normal"/>
     <w:qFormat/>
+    <w:pPr/>
     <w:rPr>
-      <w:rFonts w:ascii="Liberation Mono" w:eastAsia="Apple SD Gothic Neo" w:hAnsi="Liberation Mono" w:cs="Liberation Mono"/>
+      <w:rFonts w:ascii="Liberation Mono" w:hAnsi="Liberation Mono" w:eastAsia="Apple SD Gothic Neo" w:cs="Liberation Mono"/>
       <w:szCs w:val="20"/>
     </w:rPr>
+  </w:style>
+  <w:style w:type="numbering" w:styleId="NoList" w:default="1">
+    <w:name w:val="No List"/>
+    <w:uiPriority w:val="99"/>
+    <w:semiHidden/>
+    <w:unhideWhenUsed/>
+    <w:qFormat/>
+  </w:style>
+  <w:style w:type="table" w:default="1" w:styleId="TableNormal">
+    <w:name w:val="Normal Table"/>
+    <w:uiPriority w:val="99"/>
+    <w:semiHidden/>
+    <w:unhideWhenUsed/>
+    <w:tblPr>
+      <w:tblCellMar>
+        <w:top w:w="0" w:type="dxa"/>
+        <w:left w:w="108" w:type="dxa"/>
+        <w:bottom w:w="0" w:type="dxa"/>
+        <w:right w:w="108" w:type="dxa"/>
+      </w:tblCellMar>
+    </w:tblPr>
   </w:style>
   <w:style w:type="table" w:styleId="TableGrid">
     <w:name w:val="Table Grid"/>
     <w:basedOn w:val="TableNormal"/>
     <w:uiPriority w:val="59"/>
-    <w:rsid w:val="004D67D3"/>
+    <w:rsid w:val="004d67d3"/>
     <w:tblPr>
       <w:tblBorders>
-        <w:top w:val="single" w:sz="4" w:space="0" w:color="auto"/>
-        <w:left w:val="single" w:sz="4" w:space="0" w:color="auto"/>
-        <w:bottom w:val="single" w:sz="4" w:space="0" w:color="auto"/>
-        <w:right w:val="single" w:sz="4" w:space="0" w:color="auto"/>
-        <w:insideH w:val="single" w:sz="4" w:space="0" w:color="auto"/>
-        <w:insideV w:val="single" w:sz="4" w:space="0" w:color="auto"/>
+        <w:top w:val="single" w:color="auto" w:sz="4" w:space="0"/>
+        <w:left w:val="single" w:color="auto" w:sz="4" w:space="0"/>
+        <w:bottom w:val="single" w:color="auto" w:sz="4" w:space="0"/>
+        <w:right w:val="single" w:color="auto" w:sz="4" w:space="0"/>
+        <w:insideH w:val="single" w:color="auto" w:sz="4" w:space="0"/>
+        <w:insideV w:val="single" w:color="auto" w:sz="4" w:space="0"/>
       </w:tblBorders>
     </w:tblPr>
   </w:style>
@@ -2913,41 +3000,41 @@
 </file>
 
 <file path=word/theme/theme1.xml><?xml version="1.0" encoding="utf-8"?>
-<a:theme xmlns:a="http://schemas.openxmlformats.org/drawingml/2006/main" name="Office 테마">
+<a:theme xmlns:a="http://schemas.openxmlformats.org/drawingml/2006/main" xmlns:r="http://schemas.openxmlformats.org/officeDocument/2006/relationships" name="Office 테마">
   <a:themeElements>
     <a:clrScheme name="Office">
       <a:dk1>
         <a:srgbClr val="000000"/>
       </a:dk1>
       <a:lt1>
-        <a:srgbClr val="FFFFFF"/>
+        <a:srgbClr val="ffffff"/>
       </a:lt1>
       <a:dk2>
-        <a:srgbClr val="1F497D"/>
+        <a:srgbClr val="1f497d"/>
       </a:dk2>
       <a:lt2>
-        <a:srgbClr val="EEECE1"/>
+        <a:srgbClr val="eeece1"/>
       </a:lt2>
       <a:accent1>
-        <a:srgbClr val="4F81BD"/>
+        <a:srgbClr val="4f81bd"/>
       </a:accent1>
       <a:accent2>
-        <a:srgbClr val="C0504D"/>
+        <a:srgbClr val="c0504d"/>
       </a:accent2>
       <a:accent3>
-        <a:srgbClr val="9BBB59"/>
+        <a:srgbClr val="9bbb59"/>
       </a:accent3>
       <a:accent4>
-        <a:srgbClr val="8064A2"/>
+        <a:srgbClr val="8064a2"/>
       </a:accent4>
       <a:accent5>
-        <a:srgbClr val="4BACC6"/>
+        <a:srgbClr val="4bacc6"/>
       </a:accent5>
       <a:accent6>
-        <a:srgbClr val="F79646"/>
+        <a:srgbClr val="f79646"/>
       </a:accent6>
       <a:hlink>
-        <a:srgbClr val="0000FF"/>
+        <a:srgbClr val="0000ff"/>
       </a:hlink>
       <a:folHlink>
         <a:srgbClr val="800080"/>
@@ -2955,12 +3042,12 @@
     </a:clrScheme>
     <a:fontScheme name="Office">
       <a:majorFont>
-        <a:latin typeface="맑은 고딕"/>
+        <a:latin typeface="맑은 고딕" pitchFamily="0" charset="1"/>
         <a:ea typeface=""/>
         <a:cs typeface=""/>
       </a:majorFont>
       <a:minorFont>
-        <a:latin typeface="맑은 고딕"/>
+        <a:latin typeface="맑은 고딕" pitchFamily="0" charset="1"/>
         <a:ea typeface=""/>
         <a:cs typeface=""/>
       </a:minorFont>
@@ -2989,7 +3076,7 @@
             </a:gs>
           </a:gsLst>
           <a:lin ang="16200000" scaled="1"/>
-          <a:tileRect/>
+          <a:tileRect l="0" t="0" r="0" b="0"/>
         </a:gradFill>
         <a:gradFill>
           <a:gsLst>
@@ -3010,7 +3097,7 @@
             </a:gs>
           </a:gsLst>
           <a:lin ang="16200000" scaled="0"/>
-          <a:tileRect/>
+          <a:tileRect l="0" t="0" r="0" b="0"/>
         </a:gradFill>
       </a:fillStyleLst>
       <a:lnStyleLst>
@@ -3061,7 +3148,7 @@
           <a:path path="circle">
             <a:fillToRect l="50000" t="-80000" r="50000" b="180000"/>
           </a:path>
-          <a:tileRect/>
+          <a:tileRect l="0" t="0" r="0" b="0"/>
         </a:gradFill>
         <a:gradFill>
           <a:gsLst>
@@ -3079,13 +3166,11 @@
           <a:path path="circle">
             <a:fillToRect l="50000" t="50000" r="50000" b="50000"/>
           </a:path>
-          <a:tileRect/>
+          <a:tileRect l="0" t="0" r="0" b="0"/>
         </a:gradFill>
       </a:bgFillStyleLst>
     </a:fmtScheme>
   </a:themeElements>
-  <a:objectDefaults/>
-  <a:extraClrSchemeLst/>
 </a:theme>
 </file>
 

</xml_diff>